<commit_message>
updated documentation to include explanation details
</commit_message>
<xml_diff>
--- a/docs/documentación del proyecto.docx
+++ b/docs/documentación del proyecto.docx
@@ -209,10 +209,10 @@
                                       <v:path o:extrusionok="f" gradientshapeok="t" o:connecttype="rect"/>
                                       <o:lock v:ext="edit" aspectratio="t"/>
                                     </v:shapetype>
-                                    <v:shape id="_x0000_i1030" type="#_x0000_t75" style="width:208.5pt;height:85.95pt" fillcolor="window">
+                                    <v:shape id="_x0000_i1026" type="#_x0000_t75" style="width:208.55pt;height:85.65pt" fillcolor="window">
                                       <v:imagedata r:id="rId8" o:title=""/>
                                     </v:shape>
-                                    <o:OLEObject Type="Embed" ProgID="CDraw5" ShapeID="_x0000_i1030" DrawAspect="Content" ObjectID="_1838474159" r:id="rId9"/>
+                                    <o:OLEObject Type="Embed" ProgID="CDraw5" ShapeID="_x0000_i1026" DrawAspect="Content" ObjectID="_1838489063" r:id="rId9"/>
                                   </w:object>
                                 </w:r>
                               </w:p>
@@ -245,10 +245,10 @@
                         <w:p>
                           <w:r>
                             <w:object w:dxaOrig="4170" w:dyaOrig="1719" w14:anchorId="187C1C26">
-                              <v:shape id="_x0000_i1030" type="#_x0000_t75" style="width:208.5pt;height:85.95pt" fillcolor="window">
+                              <v:shape id="_x0000_i1026" type="#_x0000_t75" style="width:208.55pt;height:85.65pt" fillcolor="window">
                                 <v:imagedata r:id="rId8" o:title=""/>
                               </v:shape>
-                              <o:OLEObject Type="Embed" ProgID="CDraw5" ShapeID="_x0000_i1030" DrawAspect="Content" ObjectID="_1838474159" r:id="rId10"/>
+                              <o:OLEObject Type="Embed" ProgID="CDraw5" ShapeID="_x0000_i1026" DrawAspect="Content" ObjectID="_1838489063" r:id="rId10"/>
                             </w:object>
                           </w:r>
                         </w:p>
@@ -505,6 +505,10 @@
         <w:sdt>
           <w:sdtPr>
             <w:rPr>
+              <w:rFonts w:asciiTheme="minorHAnsi" w:eastAsiaTheme="minorEastAsia" w:hAnsiTheme="minorHAnsi" w:cstheme="minorBidi"/>
+              <w:color w:val="auto"/>
+              <w:sz w:val="22"/>
+              <w:szCs w:val="22"/>
               <w:lang w:val="es-ES"/>
             </w:rPr>
             <w:id w:val="1989361489"/>
@@ -515,12 +519,8 @@
           </w:sdtPr>
           <w:sdtEndPr>
             <w:rPr>
-              <w:rFonts w:asciiTheme="minorHAnsi" w:eastAsiaTheme="minorEastAsia" w:hAnsiTheme="minorHAnsi" w:cstheme="minorBidi"/>
               <w:b/>
               <w:bCs/>
-              <w:color w:val="auto"/>
-              <w:sz w:val="22"/>
-              <w:szCs w:val="22"/>
             </w:rPr>
           </w:sdtEndPr>
           <w:sdtContent>
@@ -559,7 +559,7 @@
               <w:r>
                 <w:fldChar w:fldCharType="separate"/>
               </w:r>
-              <w:hyperlink w:anchor="_Toc227861303" w:history="1">
+              <w:hyperlink w:anchor="_Toc227875839" w:history="1">
                 <w:r>
                   <w:rPr>
                     <w:rStyle w:val="Hipervnculo"/>
@@ -588,7 +588,7 @@
                     <w:noProof/>
                     <w:webHidden/>
                   </w:rPr>
-                  <w:instrText xml:space="preserve"> PAGEREF _Toc227861303 \h </w:instrText>
+                  <w:instrText xml:space="preserve"> PAGEREF _Toc227875839 \h </w:instrText>
                 </w:r>
                 <w:r>
                   <w:rPr>
@@ -634,14 +634,14 @@
                   <w14:ligatures w14:val="standardContextual"/>
                 </w:rPr>
               </w:pPr>
-              <w:hyperlink w:anchor="_Toc227861304" w:history="1">
+              <w:hyperlink w:anchor="_Toc227875840" w:history="1">
                 <w:r>
                   <w:rPr>
                     <w:rStyle w:val="Hipervnculo"/>
                     <w:noProof/>
                     <w:lang w:eastAsia="es-MX"/>
                   </w:rPr>
-                  <w:t>Componentes del Sistema:</w:t>
+                  <w:t>Recursos compartidos</w:t>
                 </w:r>
                 <w:r>
                   <w:rPr>
@@ -662,7 +662,7 @@
                     <w:noProof/>
                     <w:webHidden/>
                   </w:rPr>
-                  <w:instrText xml:space="preserve"> PAGEREF _Toc227861304 \h </w:instrText>
+                  <w:instrText xml:space="preserve"> PAGEREF _Toc227875840 \h </w:instrText>
                 </w:r>
                 <w:r>
                   <w:rPr>
@@ -683,6 +683,444 @@
                     <w:webHidden/>
                   </w:rPr>
                   <w:t>2</w:t>
+                </w:r>
+                <w:r>
+                  <w:rPr>
+                    <w:noProof/>
+                    <w:webHidden/>
+                  </w:rPr>
+                  <w:fldChar w:fldCharType="end"/>
+                </w:r>
+              </w:hyperlink>
+            </w:p>
+            <w:p>
+              <w:pPr>
+                <w:pStyle w:val="TDC1"/>
+                <w:tabs>
+                  <w:tab w:val="right" w:leader="dot" w:pos="10416"/>
+                </w:tabs>
+                <w:rPr>
+                  <w:noProof/>
+                  <w:kern w:val="2"/>
+                  <w:sz w:val="24"/>
+                  <w:szCs w:val="24"/>
+                  <w:lang w:eastAsia="es-MX"/>
+                  <w14:ligatures w14:val="standardContextual"/>
+                </w:rPr>
+              </w:pPr>
+              <w:hyperlink w:anchor="_Toc227875841" w:history="1">
+                <w:r>
+                  <w:rPr>
+                    <w:rStyle w:val="Hipervnculo"/>
+                    <w:noProof/>
+                  </w:rPr>
+                  <w:t>Interfaz Grafica</w:t>
+                </w:r>
+                <w:r>
+                  <w:rPr>
+                    <w:noProof/>
+                    <w:webHidden/>
+                  </w:rPr>
+                  <w:tab/>
+                </w:r>
+                <w:r>
+                  <w:rPr>
+                    <w:noProof/>
+                    <w:webHidden/>
+                  </w:rPr>
+                  <w:fldChar w:fldCharType="begin"/>
+                </w:r>
+                <w:r>
+                  <w:rPr>
+                    <w:noProof/>
+                    <w:webHidden/>
+                  </w:rPr>
+                  <w:instrText xml:space="preserve"> PAGEREF _Toc227875841 \h </w:instrText>
+                </w:r>
+                <w:r>
+                  <w:rPr>
+                    <w:noProof/>
+                    <w:webHidden/>
+                  </w:rPr>
+                </w:r>
+                <w:r>
+                  <w:rPr>
+                    <w:noProof/>
+                    <w:webHidden/>
+                  </w:rPr>
+                  <w:fldChar w:fldCharType="separate"/>
+                </w:r>
+                <w:r>
+                  <w:rPr>
+                    <w:noProof/>
+                    <w:webHidden/>
+                  </w:rPr>
+                  <w:t>2</w:t>
+                </w:r>
+                <w:r>
+                  <w:rPr>
+                    <w:noProof/>
+                    <w:webHidden/>
+                  </w:rPr>
+                  <w:fldChar w:fldCharType="end"/>
+                </w:r>
+              </w:hyperlink>
+            </w:p>
+            <w:p>
+              <w:pPr>
+                <w:pStyle w:val="TDC1"/>
+                <w:tabs>
+                  <w:tab w:val="right" w:leader="dot" w:pos="10416"/>
+                </w:tabs>
+                <w:rPr>
+                  <w:noProof/>
+                  <w:kern w:val="2"/>
+                  <w:sz w:val="24"/>
+                  <w:szCs w:val="24"/>
+                  <w:lang w:eastAsia="es-MX"/>
+                  <w14:ligatures w14:val="standardContextual"/>
+                </w:rPr>
+              </w:pPr>
+              <w:hyperlink w:anchor="_Toc227875842" w:history="1">
+                <w:r>
+                  <w:rPr>
+                    <w:rStyle w:val="Hipervnculo"/>
+                    <w:noProof/>
+                  </w:rPr>
+                  <w:t>Modelo cliente consumidor:</w:t>
+                </w:r>
+                <w:r>
+                  <w:rPr>
+                    <w:noProof/>
+                    <w:webHidden/>
+                  </w:rPr>
+                  <w:tab/>
+                </w:r>
+                <w:r>
+                  <w:rPr>
+                    <w:noProof/>
+                    <w:webHidden/>
+                  </w:rPr>
+                  <w:fldChar w:fldCharType="begin"/>
+                </w:r>
+                <w:r>
+                  <w:rPr>
+                    <w:noProof/>
+                    <w:webHidden/>
+                  </w:rPr>
+                  <w:instrText xml:space="preserve"> PAGEREF _Toc227875842 \h </w:instrText>
+                </w:r>
+                <w:r>
+                  <w:rPr>
+                    <w:noProof/>
+                    <w:webHidden/>
+                  </w:rPr>
+                </w:r>
+                <w:r>
+                  <w:rPr>
+                    <w:noProof/>
+                    <w:webHidden/>
+                  </w:rPr>
+                  <w:fldChar w:fldCharType="separate"/>
+                </w:r>
+                <w:r>
+                  <w:rPr>
+                    <w:noProof/>
+                    <w:webHidden/>
+                  </w:rPr>
+                  <w:t>2</w:t>
+                </w:r>
+                <w:r>
+                  <w:rPr>
+                    <w:noProof/>
+                    <w:webHidden/>
+                  </w:rPr>
+                  <w:fldChar w:fldCharType="end"/>
+                </w:r>
+              </w:hyperlink>
+            </w:p>
+            <w:p>
+              <w:pPr>
+                <w:pStyle w:val="TDC1"/>
+                <w:tabs>
+                  <w:tab w:val="right" w:leader="dot" w:pos="10416"/>
+                </w:tabs>
+                <w:rPr>
+                  <w:noProof/>
+                  <w:kern w:val="2"/>
+                  <w:sz w:val="24"/>
+                  <w:szCs w:val="24"/>
+                  <w:lang w:eastAsia="es-MX"/>
+                  <w14:ligatures w14:val="standardContextual"/>
+                </w:rPr>
+              </w:pPr>
+              <w:hyperlink w:anchor="_Toc227875843" w:history="1">
+                <w:r>
+                  <w:rPr>
+                    <w:rStyle w:val="Hipervnculo"/>
+                    <w:noProof/>
+                  </w:rPr>
+                  <w:t>Locks y sincronización</w:t>
+                </w:r>
+                <w:r>
+                  <w:rPr>
+                    <w:noProof/>
+                    <w:webHidden/>
+                  </w:rPr>
+                  <w:tab/>
+                </w:r>
+                <w:r>
+                  <w:rPr>
+                    <w:noProof/>
+                    <w:webHidden/>
+                  </w:rPr>
+                  <w:fldChar w:fldCharType="begin"/>
+                </w:r>
+                <w:r>
+                  <w:rPr>
+                    <w:noProof/>
+                    <w:webHidden/>
+                  </w:rPr>
+                  <w:instrText xml:space="preserve"> PAGEREF _Toc227875843 \h </w:instrText>
+                </w:r>
+                <w:r>
+                  <w:rPr>
+                    <w:noProof/>
+                    <w:webHidden/>
+                  </w:rPr>
+                </w:r>
+                <w:r>
+                  <w:rPr>
+                    <w:noProof/>
+                    <w:webHidden/>
+                  </w:rPr>
+                  <w:fldChar w:fldCharType="separate"/>
+                </w:r>
+                <w:r>
+                  <w:rPr>
+                    <w:noProof/>
+                    <w:webHidden/>
+                  </w:rPr>
+                  <w:t>3</w:t>
+                </w:r>
+                <w:r>
+                  <w:rPr>
+                    <w:noProof/>
+                    <w:webHidden/>
+                  </w:rPr>
+                  <w:fldChar w:fldCharType="end"/>
+                </w:r>
+              </w:hyperlink>
+            </w:p>
+            <w:p>
+              <w:pPr>
+                <w:pStyle w:val="TDC1"/>
+                <w:tabs>
+                  <w:tab w:val="right" w:leader="dot" w:pos="10416"/>
+                </w:tabs>
+                <w:rPr>
+                  <w:noProof/>
+                  <w:kern w:val="2"/>
+                  <w:sz w:val="24"/>
+                  <w:szCs w:val="24"/>
+                  <w:lang w:eastAsia="es-MX"/>
+                  <w14:ligatures w14:val="standardContextual"/>
+                </w:rPr>
+              </w:pPr>
+              <w:hyperlink w:anchor="_Toc227875844" w:history="1">
+                <w:r>
+                  <w:rPr>
+                    <w:rStyle w:val="Hipervnculo"/>
+                    <w:noProof/>
+                  </w:rPr>
+                  <w:t>Medición de rendimiento</w:t>
+                </w:r>
+                <w:r>
+                  <w:rPr>
+                    <w:noProof/>
+                    <w:webHidden/>
+                  </w:rPr>
+                  <w:tab/>
+                </w:r>
+                <w:r>
+                  <w:rPr>
+                    <w:noProof/>
+                    <w:webHidden/>
+                  </w:rPr>
+                  <w:fldChar w:fldCharType="begin"/>
+                </w:r>
+                <w:r>
+                  <w:rPr>
+                    <w:noProof/>
+                    <w:webHidden/>
+                  </w:rPr>
+                  <w:instrText xml:space="preserve"> PAGEREF _Toc227875844 \h </w:instrText>
+                </w:r>
+                <w:r>
+                  <w:rPr>
+                    <w:noProof/>
+                    <w:webHidden/>
+                  </w:rPr>
+                </w:r>
+                <w:r>
+                  <w:rPr>
+                    <w:noProof/>
+                    <w:webHidden/>
+                  </w:rPr>
+                  <w:fldChar w:fldCharType="separate"/>
+                </w:r>
+                <w:r>
+                  <w:rPr>
+                    <w:noProof/>
+                    <w:webHidden/>
+                  </w:rPr>
+                  <w:t>3</w:t>
+                </w:r>
+                <w:r>
+                  <w:rPr>
+                    <w:noProof/>
+                    <w:webHidden/>
+                  </w:rPr>
+                  <w:fldChar w:fldCharType="end"/>
+                </w:r>
+              </w:hyperlink>
+            </w:p>
+            <w:p>
+              <w:pPr>
+                <w:pStyle w:val="TDC1"/>
+                <w:tabs>
+                  <w:tab w:val="right" w:leader="dot" w:pos="10416"/>
+                </w:tabs>
+                <w:rPr>
+                  <w:noProof/>
+                  <w:kern w:val="2"/>
+                  <w:sz w:val="24"/>
+                  <w:szCs w:val="24"/>
+                  <w:lang w:eastAsia="es-MX"/>
+                  <w14:ligatures w14:val="standardContextual"/>
+                </w:rPr>
+              </w:pPr>
+              <w:hyperlink w:anchor="_Toc227875845" w:history="1">
+                <w:r>
+                  <w:rPr>
+                    <w:rStyle w:val="Hipervnculo"/>
+                    <w:noProof/>
+                  </w:rPr>
+                  <w:t>Cola Queue</w:t>
+                </w:r>
+                <w:r>
+                  <w:rPr>
+                    <w:noProof/>
+                    <w:webHidden/>
+                  </w:rPr>
+                  <w:tab/>
+                </w:r>
+                <w:r>
+                  <w:rPr>
+                    <w:noProof/>
+                    <w:webHidden/>
+                  </w:rPr>
+                  <w:fldChar w:fldCharType="begin"/>
+                </w:r>
+                <w:r>
+                  <w:rPr>
+                    <w:noProof/>
+                    <w:webHidden/>
+                  </w:rPr>
+                  <w:instrText xml:space="preserve"> PAGEREF _Toc227875845 \h </w:instrText>
+                </w:r>
+                <w:r>
+                  <w:rPr>
+                    <w:noProof/>
+                    <w:webHidden/>
+                  </w:rPr>
+                </w:r>
+                <w:r>
+                  <w:rPr>
+                    <w:noProof/>
+                    <w:webHidden/>
+                  </w:rPr>
+                  <w:fldChar w:fldCharType="separate"/>
+                </w:r>
+                <w:r>
+                  <w:rPr>
+                    <w:noProof/>
+                    <w:webHidden/>
+                  </w:rPr>
+                  <w:t>3</w:t>
+                </w:r>
+                <w:r>
+                  <w:rPr>
+                    <w:noProof/>
+                    <w:webHidden/>
+                  </w:rPr>
+                  <w:fldChar w:fldCharType="end"/>
+                </w:r>
+              </w:hyperlink>
+            </w:p>
+            <w:p>
+              <w:pPr>
+                <w:pStyle w:val="TDC1"/>
+                <w:tabs>
+                  <w:tab w:val="right" w:leader="dot" w:pos="10416"/>
+                </w:tabs>
+                <w:rPr>
+                  <w:noProof/>
+                  <w:kern w:val="2"/>
+                  <w:sz w:val="24"/>
+                  <w:szCs w:val="24"/>
+                  <w:lang w:eastAsia="es-MX"/>
+                  <w14:ligatures w14:val="standardContextual"/>
+                </w:rPr>
+              </w:pPr>
+              <w:hyperlink w:anchor="_Toc227875846" w:history="1">
+                <w:r>
+                  <w:rPr>
+                    <w:rStyle w:val="Hipervnculo"/>
+                    <w:noProof/>
+                  </w:rPr>
+                  <w:t>Funcionamiento</w:t>
+                </w:r>
+                <w:r>
+                  <w:rPr>
+                    <w:noProof/>
+                    <w:webHidden/>
+                  </w:rPr>
+                  <w:tab/>
+                </w:r>
+                <w:r>
+                  <w:rPr>
+                    <w:noProof/>
+                    <w:webHidden/>
+                  </w:rPr>
+                  <w:fldChar w:fldCharType="begin"/>
+                </w:r>
+                <w:r>
+                  <w:rPr>
+                    <w:noProof/>
+                    <w:webHidden/>
+                  </w:rPr>
+                  <w:instrText xml:space="preserve"> PAGEREF _Toc227875846 \h </w:instrText>
+                </w:r>
+                <w:r>
+                  <w:rPr>
+                    <w:noProof/>
+                    <w:webHidden/>
+                  </w:rPr>
+                </w:r>
+                <w:r>
+                  <w:rPr>
+                    <w:noProof/>
+                    <w:webHidden/>
+                  </w:rPr>
+                  <w:fldChar w:fldCharType="separate"/>
+                </w:r>
+                <w:r>
+                  <w:rPr>
+                    <w:noProof/>
+                    <w:webHidden/>
+                  </w:rPr>
+                  <w:t>4</w:t>
                 </w:r>
                 <w:r>
                   <w:rPr>
@@ -708,14 +1146,14 @@
                   <w14:ligatures w14:val="standardContextual"/>
                 </w:rPr>
               </w:pPr>
-              <w:hyperlink w:anchor="_Toc227861305" w:history="1">
+              <w:hyperlink w:anchor="_Toc227875847" w:history="1">
                 <w:r>
                   <w:rPr>
                     <w:rStyle w:val="Hipervnculo"/>
                     <w:noProof/>
                     <w:lang w:eastAsia="es-MX"/>
                   </w:rPr>
-                  <w:t>Modelo de datos</w:t>
+                  <w:t>Componentes del Sistema:</w:t>
                 </w:r>
                 <w:r>
                   <w:rPr>
@@ -736,7 +1174,7 @@
                     <w:noProof/>
                     <w:webHidden/>
                   </w:rPr>
-                  <w:instrText xml:space="preserve"> PAGEREF _Toc227861305 \h </w:instrText>
+                  <w:instrText xml:space="preserve"> PAGEREF _Toc227875847 \h </w:instrText>
                 </w:r>
                 <w:r>
                   <w:rPr>
@@ -756,7 +1194,7 @@
                     <w:noProof/>
                     <w:webHidden/>
                   </w:rPr>
-                  <w:t>2</w:t>
+                  <w:t>4</w:t>
                 </w:r>
                 <w:r>
                   <w:rPr>
@@ -782,13 +1220,14 @@
                   <w14:ligatures w14:val="standardContextual"/>
                 </w:rPr>
               </w:pPr>
-              <w:hyperlink w:anchor="_Toc227861306" w:history="1">
+              <w:hyperlink w:anchor="_Toc227875848" w:history="1">
                 <w:r>
                   <w:rPr>
                     <w:rStyle w:val="Hipervnculo"/>
                     <w:noProof/>
-                  </w:rPr>
-                  <w:t>Ejecución:</w:t>
+                    <w:lang w:eastAsia="es-MX"/>
+                  </w:rPr>
+                  <w:t>Base de datos:</w:t>
                 </w:r>
                 <w:r>
                   <w:rPr>
@@ -809,7 +1248,7 @@
                     <w:noProof/>
                     <w:webHidden/>
                   </w:rPr>
-                  <w:instrText xml:space="preserve"> PAGEREF _Toc227861306 \h </w:instrText>
+                  <w:instrText xml:space="preserve"> PAGEREF _Toc227875848 \h </w:instrText>
                 </w:r>
                 <w:r>
                   <w:rPr>
@@ -829,7 +1268,81 @@
                     <w:noProof/>
                     <w:webHidden/>
                   </w:rPr>
-                  <w:t>3</w:t>
+                  <w:t>4</w:t>
+                </w:r>
+                <w:r>
+                  <w:rPr>
+                    <w:noProof/>
+                    <w:webHidden/>
+                  </w:rPr>
+                  <w:fldChar w:fldCharType="end"/>
+                </w:r>
+              </w:hyperlink>
+            </w:p>
+            <w:p>
+              <w:pPr>
+                <w:pStyle w:val="TDC2"/>
+                <w:tabs>
+                  <w:tab w:val="right" w:leader="dot" w:pos="10416"/>
+                </w:tabs>
+                <w:rPr>
+                  <w:noProof/>
+                  <w:kern w:val="2"/>
+                  <w:sz w:val="24"/>
+                  <w:szCs w:val="24"/>
+                  <w:lang w:eastAsia="es-MX"/>
+                  <w14:ligatures w14:val="standardContextual"/>
+                </w:rPr>
+              </w:pPr>
+              <w:hyperlink w:anchor="_Toc227875849" w:history="1">
+                <w:r>
+                  <w:rPr>
+                    <w:rStyle w:val="Hipervnculo"/>
+                    <w:noProof/>
+                    <w:lang w:eastAsia="es-MX"/>
+                  </w:rPr>
+                  <w:t>Modelo de datos</w:t>
+                </w:r>
+                <w:r>
+                  <w:rPr>
+                    <w:noProof/>
+                    <w:webHidden/>
+                  </w:rPr>
+                  <w:tab/>
+                </w:r>
+                <w:r>
+                  <w:rPr>
+                    <w:noProof/>
+                    <w:webHidden/>
+                  </w:rPr>
+                  <w:fldChar w:fldCharType="begin"/>
+                </w:r>
+                <w:r>
+                  <w:rPr>
+                    <w:noProof/>
+                    <w:webHidden/>
+                  </w:rPr>
+                  <w:instrText xml:space="preserve"> PAGEREF _Toc227875849 \h </w:instrText>
+                </w:r>
+                <w:r>
+                  <w:rPr>
+                    <w:noProof/>
+                    <w:webHidden/>
+                  </w:rPr>
+                </w:r>
+                <w:r>
+                  <w:rPr>
+                    <w:noProof/>
+                    <w:webHidden/>
+                  </w:rPr>
+                  <w:fldChar w:fldCharType="separate"/>
+                </w:r>
+                <w:r>
+                  <w:rPr>
+                    <w:noProof/>
+                    <w:webHidden/>
+                  </w:rPr>
+                  <w:t>4</w:t>
                 </w:r>
                 <w:r>
                   <w:rPr>
@@ -855,12 +1368,85 @@
                   <w14:ligatures w14:val="standardContextual"/>
                 </w:rPr>
               </w:pPr>
-              <w:hyperlink w:anchor="_Toc227861307" w:history="1">
+              <w:hyperlink w:anchor="_Toc227875850" w:history="1">
                 <w:r>
                   <w:rPr>
                     <w:rStyle w:val="Hipervnculo"/>
                     <w:noProof/>
                   </w:rPr>
+                  <w:t>Ejecución:</w:t>
+                </w:r>
+                <w:r>
+                  <w:rPr>
+                    <w:noProof/>
+                    <w:webHidden/>
+                  </w:rPr>
+                  <w:tab/>
+                </w:r>
+                <w:r>
+                  <w:rPr>
+                    <w:noProof/>
+                    <w:webHidden/>
+                  </w:rPr>
+                  <w:fldChar w:fldCharType="begin"/>
+                </w:r>
+                <w:r>
+                  <w:rPr>
+                    <w:noProof/>
+                    <w:webHidden/>
+                  </w:rPr>
+                  <w:instrText xml:space="preserve"> PAGEREF _Toc227875850 \h </w:instrText>
+                </w:r>
+                <w:r>
+                  <w:rPr>
+                    <w:noProof/>
+                    <w:webHidden/>
+                  </w:rPr>
+                </w:r>
+                <w:r>
+                  <w:rPr>
+                    <w:noProof/>
+                    <w:webHidden/>
+                  </w:rPr>
+                  <w:fldChar w:fldCharType="separate"/>
+                </w:r>
+                <w:r>
+                  <w:rPr>
+                    <w:noProof/>
+                    <w:webHidden/>
+                  </w:rPr>
+                  <w:t>5</w:t>
+                </w:r>
+                <w:r>
+                  <w:rPr>
+                    <w:noProof/>
+                    <w:webHidden/>
+                  </w:rPr>
+                  <w:fldChar w:fldCharType="end"/>
+                </w:r>
+              </w:hyperlink>
+            </w:p>
+            <w:p>
+              <w:pPr>
+                <w:pStyle w:val="TDC1"/>
+                <w:tabs>
+                  <w:tab w:val="right" w:leader="dot" w:pos="10416"/>
+                </w:tabs>
+                <w:rPr>
+                  <w:noProof/>
+                  <w:kern w:val="2"/>
+                  <w:sz w:val="24"/>
+                  <w:szCs w:val="24"/>
+                  <w:lang w:eastAsia="es-MX"/>
+                  <w14:ligatures w14:val="standardContextual"/>
+                </w:rPr>
+              </w:pPr>
+              <w:hyperlink w:anchor="_Toc227875851" w:history="1">
+                <w:r>
+                  <w:rPr>
+                    <w:rStyle w:val="Hipervnculo"/>
+                    <w:noProof/>
+                  </w:rPr>
                   <w:t>Prompts:</w:t>
                 </w:r>
                 <w:r>
@@ -882,7 +1468,7 @@
                     <w:noProof/>
                     <w:webHidden/>
                   </w:rPr>
-                  <w:instrText xml:space="preserve"> PAGEREF _Toc227861307 \h </w:instrText>
+                  <w:instrText xml:space="preserve"> PAGEREF _Toc227875851 \h </w:instrText>
                 </w:r>
                 <w:r>
                   <w:rPr>
@@ -902,7 +1488,7 @@
                     <w:noProof/>
                     <w:webHidden/>
                   </w:rPr>
-                  <w:t>10</w:t>
+                  <w:t>13</w:t>
                 </w:r>
                 <w:r>
                   <w:rPr>
@@ -928,7 +1514,7 @@
                   <w14:ligatures w14:val="standardContextual"/>
                 </w:rPr>
               </w:pPr>
-              <w:hyperlink w:anchor="_Toc227861308" w:history="1">
+              <w:hyperlink w:anchor="_Toc227875852" w:history="1">
                 <w:r>
                   <w:rPr>
                     <w:rStyle w:val="Hipervnculo"/>
@@ -955,7 +1541,7 @@
                     <w:noProof/>
                     <w:webHidden/>
                   </w:rPr>
-                  <w:instrText xml:space="preserve"> PAGEREF _Toc227861308 \h </w:instrText>
+                  <w:instrText xml:space="preserve"> PAGEREF _Toc227875852 \h </w:instrText>
                 </w:r>
                 <w:r>
                   <w:rPr>
@@ -975,7 +1561,7 @@
                     <w:noProof/>
                     <w:webHidden/>
                   </w:rPr>
-                  <w:t>10</w:t>
+                  <w:t>13</w:t>
                 </w:r>
                 <w:r>
                   <w:rPr>
@@ -1001,7 +1587,7 @@
                   <w14:ligatures w14:val="standardContextual"/>
                 </w:rPr>
               </w:pPr>
-              <w:hyperlink w:anchor="_Toc227861309" w:history="1">
+              <w:hyperlink w:anchor="_Toc227875853" w:history="1">
                 <w:r>
                   <w:rPr>
                     <w:rStyle w:val="Hipervnculo"/>
@@ -1028,7 +1614,7 @@
                     <w:noProof/>
                     <w:webHidden/>
                   </w:rPr>
-                  <w:instrText xml:space="preserve"> PAGEREF _Toc227861309 \h </w:instrText>
+                  <w:instrText xml:space="preserve"> PAGEREF _Toc227875853 \h </w:instrText>
                 </w:r>
                 <w:r>
                   <w:rPr>
@@ -1048,7 +1634,7 @@
                     <w:noProof/>
                     <w:webHidden/>
                   </w:rPr>
-                  <w:t>11</w:t>
+                  <w:t>14</w:t>
                 </w:r>
                 <w:r>
                   <w:rPr>
@@ -1074,7 +1660,7 @@
                   <w14:ligatures w14:val="standardContextual"/>
                 </w:rPr>
               </w:pPr>
-              <w:hyperlink w:anchor="_Toc227861310" w:history="1">
+              <w:hyperlink w:anchor="_Toc227875854" w:history="1">
                 <w:r>
                   <w:rPr>
                     <w:rStyle w:val="Hipervnculo"/>
@@ -1101,7 +1687,7 @@
                     <w:noProof/>
                     <w:webHidden/>
                   </w:rPr>
-                  <w:instrText xml:space="preserve"> PAGEREF _Toc227861310 \h </w:instrText>
+                  <w:instrText xml:space="preserve"> PAGEREF _Toc227875854 \h </w:instrText>
                 </w:r>
                 <w:r>
                   <w:rPr>
@@ -1121,7 +1707,7 @@
                     <w:noProof/>
                     <w:webHidden/>
                   </w:rPr>
-                  <w:t>11</w:t>
+                  <w:t>14</w:t>
                 </w:r>
                 <w:r>
                   <w:rPr>
@@ -1147,7 +1733,7 @@
                   <w14:ligatures w14:val="standardContextual"/>
                 </w:rPr>
               </w:pPr>
-              <w:hyperlink w:anchor="_Toc227861311" w:history="1">
+              <w:hyperlink w:anchor="_Toc227875855" w:history="1">
                 <w:r>
                   <w:rPr>
                     <w:rStyle w:val="Hipervnculo"/>
@@ -1174,7 +1760,7 @@
                     <w:noProof/>
                     <w:webHidden/>
                   </w:rPr>
-                  <w:instrText xml:space="preserve"> PAGEREF _Toc227861311 \h </w:instrText>
+                  <w:instrText xml:space="preserve"> PAGEREF _Toc227875855 \h </w:instrText>
                 </w:r>
                 <w:r>
                   <w:rPr>
@@ -1194,7 +1780,7 @@
                     <w:noProof/>
                     <w:webHidden/>
                   </w:rPr>
-                  <w:t>11</w:t>
+                  <w:t>14</w:t>
                 </w:r>
                 <w:r>
                   <w:rPr>
@@ -1220,7 +1806,7 @@
                   <w14:ligatures w14:val="standardContextual"/>
                 </w:rPr>
               </w:pPr>
-              <w:hyperlink w:anchor="_Toc227861312" w:history="1">
+              <w:hyperlink w:anchor="_Toc227875856" w:history="1">
                 <w:r>
                   <w:rPr>
                     <w:rStyle w:val="Hipervnculo"/>
@@ -1247,7 +1833,7 @@
                     <w:noProof/>
                     <w:webHidden/>
                   </w:rPr>
-                  <w:instrText xml:space="preserve"> PAGEREF _Toc227861312 \h </w:instrText>
+                  <w:instrText xml:space="preserve"> PAGEREF _Toc227875856 \h </w:instrText>
                 </w:r>
                 <w:r>
                   <w:rPr>
@@ -1267,7 +1853,7 @@
                     <w:noProof/>
                     <w:webHidden/>
                   </w:rPr>
-                  <w:t>11</w:t>
+                  <w:t>14</w:t>
                 </w:r>
                 <w:r>
                   <w:rPr>
@@ -1293,7 +1879,7 @@
                   <w14:ligatures w14:val="standardContextual"/>
                 </w:rPr>
               </w:pPr>
-              <w:hyperlink w:anchor="_Toc227861313" w:history="1">
+              <w:hyperlink w:anchor="_Toc227875857" w:history="1">
                 <w:r>
                   <w:rPr>
                     <w:rStyle w:val="Hipervnculo"/>
@@ -1320,7 +1906,7 @@
                     <w:noProof/>
                     <w:webHidden/>
                   </w:rPr>
-                  <w:instrText xml:space="preserve"> PAGEREF _Toc227861313 \h </w:instrText>
+                  <w:instrText xml:space="preserve"> PAGEREF _Toc227875857 \h </w:instrText>
                 </w:r>
                 <w:r>
                   <w:rPr>
@@ -1340,7 +1926,7 @@
                     <w:noProof/>
                     <w:webHidden/>
                   </w:rPr>
-                  <w:t>11</w:t>
+                  <w:t>14</w:t>
                 </w:r>
                 <w:r>
                   <w:rPr>
@@ -1366,7 +1952,7 @@
                   <w14:ligatures w14:val="standardContextual"/>
                 </w:rPr>
               </w:pPr>
-              <w:hyperlink w:anchor="_Toc227861314" w:history="1">
+              <w:hyperlink w:anchor="_Toc227875858" w:history="1">
                 <w:r>
                   <w:rPr>
                     <w:rStyle w:val="Hipervnculo"/>
@@ -1393,7 +1979,7 @@
                     <w:noProof/>
                     <w:webHidden/>
                   </w:rPr>
-                  <w:instrText xml:space="preserve"> PAGEREF _Toc227861314 \h </w:instrText>
+                  <w:instrText xml:space="preserve"> PAGEREF _Toc227875858 \h </w:instrText>
                 </w:r>
                 <w:r>
                   <w:rPr>
@@ -1413,7 +1999,7 @@
                     <w:noProof/>
                     <w:webHidden/>
                   </w:rPr>
-                  <w:t>11</w:t>
+                  <w:t>14</w:t>
                 </w:r>
                 <w:r>
                   <w:rPr>
@@ -1439,7 +2025,7 @@
                   <w14:ligatures w14:val="standardContextual"/>
                 </w:rPr>
               </w:pPr>
-              <w:hyperlink w:anchor="_Toc227861315" w:history="1">
+              <w:hyperlink w:anchor="_Toc227875859" w:history="1">
                 <w:r>
                   <w:rPr>
                     <w:rStyle w:val="Hipervnculo"/>
@@ -1466,7 +2052,7 @@
                     <w:noProof/>
                     <w:webHidden/>
                   </w:rPr>
-                  <w:instrText xml:space="preserve"> PAGEREF _Toc227861315 \h </w:instrText>
+                  <w:instrText xml:space="preserve"> PAGEREF _Toc227875859 \h </w:instrText>
                 </w:r>
                 <w:r>
                   <w:rPr>
@@ -1486,7 +2072,7 @@
                     <w:noProof/>
                     <w:webHidden/>
                   </w:rPr>
-                  <w:t>12</w:t>
+                  <w:t>15</w:t>
                 </w:r>
                 <w:r>
                   <w:rPr>
@@ -1512,7 +2098,7 @@
                   <w14:ligatures w14:val="standardContextual"/>
                 </w:rPr>
               </w:pPr>
-              <w:hyperlink w:anchor="_Toc227861316" w:history="1">
+              <w:hyperlink w:anchor="_Toc227875860" w:history="1">
                 <w:r>
                   <w:rPr>
                     <w:rStyle w:val="Hipervnculo"/>
@@ -1541,7 +2127,7 @@
                     <w:noProof/>
                     <w:webHidden/>
                   </w:rPr>
-                  <w:instrText xml:space="preserve"> PAGEREF _Toc227861316 \h </w:instrText>
+                  <w:instrText xml:space="preserve"> PAGEREF _Toc227875860 \h </w:instrText>
                 </w:r>
                 <w:r>
                   <w:rPr>
@@ -1561,7 +2147,7 @@
                     <w:noProof/>
                     <w:webHidden/>
                   </w:rPr>
-                  <w:t>12</w:t>
+                  <w:t>15</w:t>
                 </w:r>
                 <w:r>
                   <w:rPr>
@@ -1587,7 +2173,7 @@
                   <w14:ligatures w14:val="standardContextual"/>
                 </w:rPr>
               </w:pPr>
-              <w:hyperlink w:anchor="_Toc227861317" w:history="1">
+              <w:hyperlink w:anchor="_Toc227875861" w:history="1">
                 <w:r>
                   <w:rPr>
                     <w:rStyle w:val="Hipervnculo"/>
@@ -1614,7 +2200,7 @@
                     <w:noProof/>
                     <w:webHidden/>
                   </w:rPr>
-                  <w:instrText xml:space="preserve"> PAGEREF _Toc227861317 \h </w:instrText>
+                  <w:instrText xml:space="preserve"> PAGEREF _Toc227875861 \h </w:instrText>
                 </w:r>
                 <w:r>
                   <w:rPr>
@@ -1634,7 +2220,7 @@
                     <w:noProof/>
                     <w:webHidden/>
                   </w:rPr>
-                  <w:t>12</w:t>
+                  <w:t>15</w:t>
                 </w:r>
                 <w:r>
                   <w:rPr>
@@ -1660,7 +2246,7 @@
                   <w14:ligatures w14:val="standardContextual"/>
                 </w:rPr>
               </w:pPr>
-              <w:hyperlink w:anchor="_Toc227861318" w:history="1">
+              <w:hyperlink w:anchor="_Toc227875862" w:history="1">
                 <w:r>
                   <w:rPr>
                     <w:rStyle w:val="Hipervnculo"/>
@@ -1687,7 +2273,7 @@
                     <w:noProof/>
                     <w:webHidden/>
                   </w:rPr>
-                  <w:instrText xml:space="preserve"> PAGEREF _Toc227861318 \h </w:instrText>
+                  <w:instrText xml:space="preserve"> PAGEREF _Toc227875862 \h </w:instrText>
                 </w:r>
                 <w:r>
                   <w:rPr>
@@ -1707,7 +2293,7 @@
                     <w:noProof/>
                     <w:webHidden/>
                   </w:rPr>
-                  <w:t>12</w:t>
+                  <w:t>15</w:t>
                 </w:r>
                 <w:r>
                   <w:rPr>
@@ -1733,7 +2319,7 @@
                   <w14:ligatures w14:val="standardContextual"/>
                 </w:rPr>
               </w:pPr>
-              <w:hyperlink w:anchor="_Toc227861319" w:history="1">
+              <w:hyperlink w:anchor="_Toc227875863" w:history="1">
                 <w:r>
                   <w:rPr>
                     <w:rStyle w:val="Hipervnculo"/>
@@ -1760,7 +2346,7 @@
                     <w:noProof/>
                     <w:webHidden/>
                   </w:rPr>
-                  <w:instrText xml:space="preserve"> PAGEREF _Toc227861319 \h </w:instrText>
+                  <w:instrText xml:space="preserve"> PAGEREF _Toc227875863 \h </w:instrText>
                 </w:r>
                 <w:r>
                   <w:rPr>
@@ -1780,7 +2366,7 @@
                     <w:noProof/>
                     <w:webHidden/>
                   </w:rPr>
-                  <w:t>12</w:t>
+                  <w:t>15</w:t>
                 </w:r>
                 <w:r>
                   <w:rPr>
@@ -1806,7 +2392,7 @@
                   <w14:ligatures w14:val="standardContextual"/>
                 </w:rPr>
               </w:pPr>
-              <w:hyperlink w:anchor="_Toc227861320" w:history="1">
+              <w:hyperlink w:anchor="_Toc227875864" w:history="1">
                 <w:r>
                   <w:rPr>
                     <w:rStyle w:val="Hipervnculo"/>
@@ -1833,7 +2419,7 @@
                     <w:noProof/>
                     <w:webHidden/>
                   </w:rPr>
-                  <w:instrText xml:space="preserve"> PAGEREF _Toc227861320 \h </w:instrText>
+                  <w:instrText xml:space="preserve"> PAGEREF _Toc227875864 \h </w:instrText>
                 </w:r>
                 <w:r>
                   <w:rPr>
@@ -1853,7 +2439,7 @@
                     <w:noProof/>
                     <w:webHidden/>
                   </w:rPr>
-                  <w:t>13</w:t>
+                  <w:t>16</w:t>
                 </w:r>
                 <w:r>
                   <w:rPr>
@@ -1879,7 +2465,7 @@
                   <w14:ligatures w14:val="standardContextual"/>
                 </w:rPr>
               </w:pPr>
-              <w:hyperlink w:anchor="_Toc227861321" w:history="1">
+              <w:hyperlink w:anchor="_Toc227875865" w:history="1">
                 <w:r>
                   <w:rPr>
                     <w:rStyle w:val="Hipervnculo"/>
@@ -1906,7 +2492,7 @@
                     <w:noProof/>
                     <w:webHidden/>
                   </w:rPr>
-                  <w:instrText xml:space="preserve"> PAGEREF _Toc227861321 \h </w:instrText>
+                  <w:instrText xml:space="preserve"> PAGEREF _Toc227875865 \h </w:instrText>
                 </w:r>
                 <w:r>
                   <w:rPr>
@@ -1926,7 +2512,7 @@
                     <w:noProof/>
                     <w:webHidden/>
                   </w:rPr>
-                  <w:t>13</w:t>
+                  <w:t>16</w:t>
                 </w:r>
                 <w:r>
                   <w:rPr>
@@ -1952,7 +2538,7 @@
                   <w14:ligatures w14:val="standardContextual"/>
                 </w:rPr>
               </w:pPr>
-              <w:hyperlink w:anchor="_Toc227861322" w:history="1">
+              <w:hyperlink w:anchor="_Toc227875866" w:history="1">
                 <w:r>
                   <w:rPr>
                     <w:rStyle w:val="Hipervnculo"/>
@@ -1979,7 +2565,7 @@
                     <w:noProof/>
                     <w:webHidden/>
                   </w:rPr>
-                  <w:instrText xml:space="preserve"> PAGEREF _Toc227861322 \h </w:instrText>
+                  <w:instrText xml:space="preserve"> PAGEREF _Toc227875866 \h </w:instrText>
                 </w:r>
                 <w:r>
                   <w:rPr>
@@ -1999,7 +2585,7 @@
                     <w:noProof/>
                     <w:webHidden/>
                   </w:rPr>
-                  <w:t>13</w:t>
+                  <w:t>16</w:t>
                 </w:r>
                 <w:r>
                   <w:rPr>
@@ -2025,27 +2611,13 @@
                   <w14:ligatures w14:val="standardContextual"/>
                 </w:rPr>
               </w:pPr>
-              <w:hyperlink w:anchor="_Toc227861323" w:history="1">
+              <w:hyperlink w:anchor="_Toc227875867" w:history="1">
                 <w:r>
                   <w:rPr>
                     <w:rStyle w:val="Hipervnculo"/>
                     <w:noProof/>
                   </w:rPr>
-                  <w:t xml:space="preserve">Prompt </w:t>
-                </w:r>
-                <w:r>
-                  <w:rPr>
-                    <w:rStyle w:val="Hipervnculo"/>
-                    <w:noProof/>
-                  </w:rPr>
-                  <w:t>1</w:t>
-                </w:r>
-                <w:r>
-                  <w:rPr>
-                    <w:rStyle w:val="Hipervnculo"/>
-                    <w:noProof/>
-                  </w:rPr>
-                  <w:t>56</w:t>
+                  <w:t>Prompt 16</w:t>
                 </w:r>
                 <w:r>
                   <w:rPr>
@@ -2066,7 +2638,7 @@
                     <w:noProof/>
                     <w:webHidden/>
                   </w:rPr>
-                  <w:instrText xml:space="preserve"> PAGEREF _Toc227861323 \h </w:instrText>
+                  <w:instrText xml:space="preserve"> PAGEREF _Toc227875867 \h </w:instrText>
                 </w:r>
                 <w:r>
                   <w:rPr>
@@ -2086,7 +2658,7 @@
                     <w:noProof/>
                     <w:webHidden/>
                   </w:rPr>
-                  <w:t>13</w:t>
+                  <w:t>16</w:t>
                 </w:r>
                 <w:r>
                   <w:rPr>
@@ -2112,7 +2684,7 @@
                   <w14:ligatures w14:val="standardContextual"/>
                 </w:rPr>
               </w:pPr>
-              <w:hyperlink w:anchor="_Toc227861324" w:history="1">
+              <w:hyperlink w:anchor="_Toc227875868" w:history="1">
                 <w:r>
                   <w:rPr>
                     <w:rStyle w:val="Hipervnculo"/>
@@ -2139,7 +2711,7 @@
                     <w:noProof/>
                     <w:webHidden/>
                   </w:rPr>
-                  <w:instrText xml:space="preserve"> PAGEREF _Toc227861324 \h </w:instrText>
+                  <w:instrText xml:space="preserve"> PAGEREF _Toc227875868 \h </w:instrText>
                 </w:r>
                 <w:r>
                   <w:rPr>
@@ -2159,7 +2731,7 @@
                     <w:noProof/>
                     <w:webHidden/>
                   </w:rPr>
-                  <w:t>13</w:t>
+                  <w:t>16</w:t>
                 </w:r>
                 <w:r>
                   <w:rPr>
@@ -2185,7 +2757,7 @@
                   <w14:ligatures w14:val="standardContextual"/>
                 </w:rPr>
               </w:pPr>
-              <w:hyperlink w:anchor="_Toc227861325" w:history="1">
+              <w:hyperlink w:anchor="_Toc227875869" w:history="1">
                 <w:r>
                   <w:rPr>
                     <w:rStyle w:val="Hipervnculo"/>
@@ -2212,7 +2784,7 @@
                     <w:noProof/>
                     <w:webHidden/>
                   </w:rPr>
-                  <w:instrText xml:space="preserve"> PAGEREF _Toc227861325 \h </w:instrText>
+                  <w:instrText xml:space="preserve"> PAGEREF _Toc227875869 \h </w:instrText>
                 </w:r>
                 <w:r>
                   <w:rPr>
@@ -2232,7 +2804,7 @@
                     <w:noProof/>
                     <w:webHidden/>
                   </w:rPr>
-                  <w:t>13</w:t>
+                  <w:t>16</w:t>
                 </w:r>
                 <w:r>
                   <w:rPr>
@@ -2258,7 +2830,7 @@
                   <w14:ligatures w14:val="standardContextual"/>
                 </w:rPr>
               </w:pPr>
-              <w:hyperlink w:anchor="_Toc227861326" w:history="1">
+              <w:hyperlink w:anchor="_Toc227875870" w:history="1">
                 <w:r>
                   <w:rPr>
                     <w:rStyle w:val="Hipervnculo"/>
@@ -2285,7 +2857,7 @@
                     <w:noProof/>
                     <w:webHidden/>
                   </w:rPr>
-                  <w:instrText xml:space="preserve"> PAGEREF _Toc227861326 \h </w:instrText>
+                  <w:instrText xml:space="preserve"> PAGEREF _Toc227875870 \h </w:instrText>
                 </w:r>
                 <w:r>
                   <w:rPr>
@@ -2305,7 +2877,7 @@
                     <w:noProof/>
                     <w:webHidden/>
                   </w:rPr>
-                  <w:t>14</w:t>
+                  <w:t>17</w:t>
                 </w:r>
                 <w:r>
                   <w:rPr>
@@ -2331,7 +2903,7 @@
                   <w14:ligatures w14:val="standardContextual"/>
                 </w:rPr>
               </w:pPr>
-              <w:hyperlink w:anchor="_Toc227861327" w:history="1">
+              <w:hyperlink w:anchor="_Toc227875871" w:history="1">
                 <w:r>
                   <w:rPr>
                     <w:rStyle w:val="Hipervnculo"/>
@@ -2358,7 +2930,7 @@
                     <w:noProof/>
                     <w:webHidden/>
                   </w:rPr>
-                  <w:instrText xml:space="preserve"> PAGEREF _Toc227861327 \h </w:instrText>
+                  <w:instrText xml:space="preserve"> PAGEREF _Toc227875871 \h </w:instrText>
                 </w:r>
                 <w:r>
                   <w:rPr>
@@ -2378,7 +2950,7 @@
                     <w:noProof/>
                     <w:webHidden/>
                   </w:rPr>
-                  <w:t>14</w:t>
+                  <w:t>17</w:t>
                 </w:r>
                 <w:r>
                   <w:rPr>
@@ -2404,7 +2976,7 @@
                   <w14:ligatures w14:val="standardContextual"/>
                 </w:rPr>
               </w:pPr>
-              <w:hyperlink w:anchor="_Toc227861328" w:history="1">
+              <w:hyperlink w:anchor="_Toc227875872" w:history="1">
                 <w:r>
                   <w:rPr>
                     <w:rStyle w:val="Hipervnculo"/>
@@ -2431,7 +3003,7 @@
                     <w:noProof/>
                     <w:webHidden/>
                   </w:rPr>
-                  <w:instrText xml:space="preserve"> PAGEREF _Toc227861328 \h </w:instrText>
+                  <w:instrText xml:space="preserve"> PAGEREF _Toc227875872 \h </w:instrText>
                 </w:r>
                 <w:r>
                   <w:rPr>
@@ -2451,7 +3023,7 @@
                     <w:noProof/>
                     <w:webHidden/>
                   </w:rPr>
-                  <w:t>14</w:t>
+                  <w:t>17</w:t>
                 </w:r>
                 <w:r>
                   <w:rPr>
@@ -2463,12 +3035,20 @@
               </w:hyperlink>
             </w:p>
             <w:p>
+              <w:pPr>
+                <w:rPr>
+                  <w:b/>
+                  <w:bCs/>
+                  <w:lang w:val="es-ES"/>
+                </w:rPr>
+              </w:pPr>
               <w:r>
                 <w:rPr>
                   <w:b/>
                   <w:bCs/>
                   <w:lang w:val="es-ES"/>
                 </w:rPr>
+                <w:lastRenderedPageBreak/>
                 <w:fldChar w:fldCharType="end"/>
               </w:r>
             </w:p>
@@ -2476,38 +3056,18 @@
         </w:sdt>
         <w:p>
           <w:pPr>
-            <w:rPr>
-              <w:rFonts w:ascii="Times New Roman" w:eastAsia="Times New Roman" w:hAnsi="Times New Roman" w:cs="Times New Roman"/>
-              <w:sz w:val="24"/>
-              <w:szCs w:val="24"/>
-              <w:lang w:eastAsia="es-MX"/>
-            </w:rPr>
-          </w:pPr>
-          <w:r>
-            <w:rPr>
-              <w:rFonts w:ascii="Times New Roman" w:eastAsia="Times New Roman" w:hAnsi="Times New Roman" w:cs="Times New Roman"/>
-              <w:sz w:val="24"/>
-              <w:szCs w:val="24"/>
-              <w:lang w:eastAsia="es-MX"/>
-            </w:rPr>
-            <w:br w:type="page"/>
-          </w:r>
-        </w:p>
-        <w:p>
-          <w:pPr>
             <w:pStyle w:val="Ttulo1"/>
             <w:rPr>
               <w:rFonts w:eastAsia="Times New Roman"/>
               <w:lang w:eastAsia="es-MX"/>
             </w:rPr>
           </w:pPr>
-          <w:bookmarkStart w:id="15" w:name="_Toc227861303"/>
+          <w:bookmarkStart w:id="15" w:name="_Toc227875839"/>
           <w:r>
             <w:rPr>
               <w:rFonts w:eastAsia="Times New Roman"/>
               <w:lang w:eastAsia="es-MX"/>
             </w:rPr>
-            <w:lastRenderedPageBreak/>
             <w:t>Descripción</w:t>
           </w:r>
           <w:bookmarkEnd w:id="15"/>
@@ -2664,193 +3224,548 @@
               <w:szCs w:val="24"/>
               <w:lang w:eastAsia="es-MX"/>
             </w:rPr>
-            <w:t>Para evitar inconsistencias, se utilizan:</w:t>
+            <w:t>A continuación se habla a detalle de las características del sistema:</w:t>
           </w:r>
         </w:p>
         <w:p>
           <w:pPr>
-            <w:rPr>
-              <w:rFonts w:ascii="Arial" w:hAnsi="Arial" w:cs="Arial"/>
-              <w:sz w:val="24"/>
-              <w:szCs w:val="24"/>
+            <w:pStyle w:val="Ttulo1"/>
+            <w:rPr>
               <w:lang w:eastAsia="es-MX"/>
             </w:rPr>
           </w:pPr>
-          <w:proofErr w:type="spellStart"/>
-          <w:r>
-            <w:rPr>
-              <w:rFonts w:ascii="Arial" w:hAnsi="Arial" w:cs="Arial"/>
-              <w:sz w:val="24"/>
-              <w:szCs w:val="24"/>
+          <w:bookmarkStart w:id="16" w:name="_Toc227875840"/>
+          <w:r>
+            <w:rPr>
               <w:lang w:eastAsia="es-MX"/>
             </w:rPr>
-            <w:t>Lock</w:t>
-          </w:r>
-          <w:proofErr w:type="spellEnd"/>
-          <w:r>
-            <w:rPr>
-              <w:rFonts w:ascii="Arial" w:hAnsi="Arial" w:cs="Arial"/>
-              <w:sz w:val="24"/>
-              <w:szCs w:val="24"/>
-              <w:lang w:eastAsia="es-MX"/>
-            </w:rPr>
-            <w:t xml:space="preserve"> (bloqueo)</w:t>
+            <w:t>Recursos compartidos</w:t>
+          </w:r>
+          <w:bookmarkEnd w:id="16"/>
+        </w:p>
+        <w:p>
+          <w:pPr>
+            <w:jc w:val="both"/>
+            <w:rPr>
+              <w:rFonts w:ascii="Arial" w:hAnsi="Arial" w:cs="Arial"/>
+              <w:sz w:val="24"/>
+              <w:szCs w:val="24"/>
+            </w:rPr>
+          </w:pPr>
+          <w:r>
+            <w:rPr>
+              <w:rFonts w:ascii="Arial" w:hAnsi="Arial" w:cs="Arial"/>
+              <w:sz w:val="24"/>
+              <w:szCs w:val="24"/>
+            </w:rPr>
+            <w:t xml:space="preserve">Estos son esenciales para lograr el funcionamiento realista del sistema, los hilos acceden </w:t>
+          </w:r>
+          <w:r>
+            <w:rPr>
+              <w:rFonts w:ascii="Arial" w:hAnsi="Arial" w:cs="Arial"/>
+              <w:sz w:val="24"/>
+              <w:szCs w:val="24"/>
+            </w:rPr>
+            <w:t>simultáneamente</w:t>
+          </w:r>
+          <w:r>
+            <w:rPr>
+              <w:rFonts w:ascii="Arial" w:hAnsi="Arial" w:cs="Arial"/>
+              <w:sz w:val="24"/>
+              <w:szCs w:val="24"/>
+            </w:rPr>
+            <w:t xml:space="preserve"> a ambos recursos:</w:t>
           </w:r>
         </w:p>
         <w:p>
           <w:pPr>
             <w:numPr>
               <w:ilvl w:val="0"/>
-              <w:numId w:val="2"/>
+              <w:numId w:val="6"/>
             </w:numPr>
-            <w:rPr>
-              <w:rFonts w:ascii="Arial" w:hAnsi="Arial" w:cs="Arial"/>
-              <w:sz w:val="24"/>
-              <w:szCs w:val="24"/>
-              <w:lang w:eastAsia="es-MX"/>
+            <w:jc w:val="both"/>
+            <w:rPr>
+              <w:rFonts w:ascii="Arial" w:hAnsi="Arial" w:cs="Arial"/>
+              <w:sz w:val="24"/>
+              <w:szCs w:val="24"/>
             </w:rPr>
           </w:pPr>
+          <w:r>
+            <w:rPr>
+              <w:rFonts w:ascii="Arial" w:hAnsi="Arial" w:cs="Arial"/>
+              <w:b/>
+              <w:bCs/>
+              <w:sz w:val="24"/>
+              <w:szCs w:val="24"/>
+            </w:rPr>
+            <w:t>La Cola de Entregas (</w:t>
+          </w:r>
           <w:proofErr w:type="spellStart"/>
           <w:r>
             <w:rPr>
               <w:rFonts w:ascii="Arial" w:hAnsi="Arial" w:cs="Arial"/>
-              <w:sz w:val="24"/>
-              <w:szCs w:val="24"/>
-              <w:lang w:eastAsia="es-MX"/>
-            </w:rPr>
-            <w:t>Prot</w:t>
-          </w:r>
-          <w:r>
-            <w:rPr>
-              <w:rFonts w:ascii="Arial" w:hAnsi="Arial" w:cs="Arial"/>
-              <w:sz w:val="24"/>
-              <w:szCs w:val="24"/>
-              <w:lang w:eastAsia="es-MX"/>
-            </w:rPr>
-            <w:t>eccion</w:t>
+              <w:b/>
+              <w:bCs/>
+              <w:sz w:val="24"/>
+              <w:szCs w:val="24"/>
+            </w:rPr>
+            <w:t>pending_deliveries</w:t>
           </w:r>
           <w:proofErr w:type="spellEnd"/>
           <w:r>
             <w:rPr>
               <w:rFonts w:ascii="Arial" w:hAnsi="Arial" w:cs="Arial"/>
-              <w:sz w:val="24"/>
-              <w:szCs w:val="24"/>
-              <w:lang w:eastAsia="es-MX"/>
-            </w:rPr>
-            <w:t xml:space="preserve"> de recursos compartidos como la base de datos o actualización de la UI</w:t>
+              <w:b/>
+              <w:bCs/>
+              <w:sz w:val="24"/>
+              <w:szCs w:val="24"/>
+            </w:rPr>
+            <w:t>):</w:t>
+          </w:r>
+          <w:r>
+            <w:rPr>
+              <w:rFonts w:ascii="Arial" w:hAnsi="Arial" w:cs="Arial"/>
+              <w:sz w:val="24"/>
+              <w:szCs w:val="24"/>
+            </w:rPr>
+            <w:t xml:space="preserve"> Es la estructura en memoria compartida donde los hilos productores depositan información y de donde los hilos consumidores extraen </w:t>
+          </w:r>
+          <w:r>
+            <w:rPr>
+              <w:rFonts w:ascii="Arial" w:hAnsi="Arial" w:cs="Arial"/>
+              <w:sz w:val="24"/>
+              <w:szCs w:val="24"/>
+            </w:rPr>
+            <w:t>los próximos pedidos que deben ser procesados de acuerdo al orden en que van llegando, se puede decir que es una estructura donde se almacenan momentáneamente los pedidos, estos esperan aquí y después de ser leídos son eliminados de aquí</w:t>
+          </w:r>
+          <w:r>
+            <w:rPr>
+              <w:rFonts w:ascii="Arial" w:hAnsi="Arial" w:cs="Arial"/>
+              <w:sz w:val="24"/>
+              <w:szCs w:val="24"/>
+            </w:rPr>
+            <w:t>.</w:t>
           </w:r>
         </w:p>
         <w:p>
           <w:pPr>
             <w:numPr>
               <w:ilvl w:val="0"/>
-              <w:numId w:val="2"/>
+              <w:numId w:val="6"/>
             </w:numPr>
-            <w:rPr>
-              <w:rFonts w:ascii="Arial" w:hAnsi="Arial" w:cs="Arial"/>
-              <w:sz w:val="24"/>
-              <w:szCs w:val="24"/>
-              <w:lang w:eastAsia="es-MX"/>
+            <w:jc w:val="both"/>
+            <w:rPr>
+              <w:rFonts w:ascii="Arial" w:hAnsi="Arial" w:cs="Arial"/>
+              <w:sz w:val="24"/>
+              <w:szCs w:val="24"/>
             </w:rPr>
           </w:pPr>
           <w:r>
             <w:rPr>
               <w:rFonts w:ascii="Arial" w:hAnsi="Arial" w:cs="Arial"/>
-              <w:sz w:val="24"/>
-              <w:szCs w:val="24"/>
-              <w:lang w:eastAsia="es-MX"/>
-            </w:rPr>
-            <w:t xml:space="preserve">Evita que múltiples hilos modifiquen los mismos datos al mismo tiempo. </w:t>
+              <w:b/>
+              <w:bCs/>
+              <w:sz w:val="24"/>
+              <w:szCs w:val="24"/>
+            </w:rPr>
+            <w:t>La Base de Datos / Sistema de Logs (</w:t>
+          </w:r>
+          <w:proofErr w:type="spellStart"/>
+          <w:r>
+            <w:rPr>
+              <w:rFonts w:ascii="Arial" w:hAnsi="Arial" w:cs="Arial"/>
+              <w:b/>
+              <w:bCs/>
+              <w:sz w:val="24"/>
+              <w:szCs w:val="24"/>
+            </w:rPr>
+            <w:t>global_logger</w:t>
+          </w:r>
+          <w:proofErr w:type="spellEnd"/>
+          <w:r>
+            <w:rPr>
+              <w:rFonts w:ascii="Arial" w:hAnsi="Arial" w:cs="Arial"/>
+              <w:b/>
+              <w:bCs/>
+              <w:sz w:val="24"/>
+              <w:szCs w:val="24"/>
+            </w:rPr>
+            <w:t>):</w:t>
+          </w:r>
+          <w:r>
+            <w:rPr>
+              <w:rFonts w:ascii="Arial" w:hAnsi="Arial" w:cs="Arial"/>
+              <w:sz w:val="24"/>
+              <w:szCs w:val="24"/>
+            </w:rPr>
+            <w:t xml:space="preserve"> Todos los hilos intentan enviar mensajes de registro simultáneamente para actualizar la interfaz gráfica o guardar los cambios de estado de los repartidores y productos. </w:t>
           </w:r>
         </w:p>
         <w:p>
           <w:pPr>
-            <w:rPr>
-              <w:rFonts w:ascii="Arial" w:hAnsi="Arial" w:cs="Arial"/>
-              <w:sz w:val="24"/>
-              <w:szCs w:val="24"/>
-              <w:lang w:eastAsia="es-MX"/>
-            </w:rPr>
+            <w:pStyle w:val="Ttulo1"/>
           </w:pPr>
-          <w:r>
-            <w:rPr>
-              <w:rFonts w:ascii="Arial" w:hAnsi="Arial" w:cs="Arial"/>
-              <w:sz w:val="24"/>
-              <w:szCs w:val="24"/>
-              <w:lang w:eastAsia="es-MX"/>
-            </w:rPr>
-            <w:t>Recursos compartidos</w:t>
-          </w:r>
+          <w:bookmarkStart w:id="17" w:name="_Toc227875841"/>
+          <w:r>
+            <w:t xml:space="preserve">Interfaz </w:t>
+          </w:r>
+          <w:proofErr w:type="spellStart"/>
+          <w:r>
+            <w:t>g</w:t>
+          </w:r>
+          <w:r>
+            <w:t>r</w:t>
+          </w:r>
+          <w:r>
+            <w:t>a</w:t>
+          </w:r>
+          <w:r>
+            <w:t>fica</w:t>
+          </w:r>
+          <w:bookmarkEnd w:id="17"/>
+          <w:proofErr w:type="spellEnd"/>
+          <w:r>
+            <w:t xml:space="preserve"> (</w:t>
+          </w:r>
+          <w:proofErr w:type="spellStart"/>
+          <w:r>
+            <w:t>framework</w:t>
+          </w:r>
+          <w:proofErr w:type="spellEnd"/>
+          <w:r>
+            <w:t xml:space="preserve"> </w:t>
+          </w:r>
+          <w:proofErr w:type="spellStart"/>
+          <w:r>
+            <w:t>Flet</w:t>
+          </w:r>
+          <w:proofErr w:type="spellEnd"/>
+          <w:r>
+            <w:t>)</w:t>
+          </w:r>
+        </w:p>
+        <w:p>
+          <w:pPr>
+            <w:jc w:val="both"/>
+            <w:rPr>
+              <w:rFonts w:ascii="Arial" w:hAnsi="Arial" w:cs="Arial"/>
+              <w:sz w:val="24"/>
+              <w:szCs w:val="24"/>
+            </w:rPr>
+          </w:pPr>
+          <w:r>
+            <w:rPr>
+              <w:rFonts w:ascii="Arial" w:hAnsi="Arial" w:cs="Arial"/>
+              <w:sz w:val="24"/>
+              <w:szCs w:val="24"/>
+            </w:rPr>
+            <w:t xml:space="preserve">La interfaz gráfica se desarrolló en </w:t>
+          </w:r>
+          <w:proofErr w:type="spellStart"/>
+          <w:r>
+            <w:rPr>
+              <w:rFonts w:ascii="Arial" w:hAnsi="Arial" w:cs="Arial"/>
+              <w:sz w:val="24"/>
+              <w:szCs w:val="24"/>
+            </w:rPr>
+            <w:t>Flet</w:t>
+          </w:r>
+          <w:proofErr w:type="spellEnd"/>
+          <w:r>
+            <w:rPr>
+              <w:rFonts w:ascii="Arial" w:hAnsi="Arial" w:cs="Arial"/>
+              <w:sz w:val="24"/>
+              <w:szCs w:val="24"/>
+            </w:rPr>
+            <w:t xml:space="preserve">, un </w:t>
+          </w:r>
+          <w:proofErr w:type="spellStart"/>
+          <w:r>
+            <w:rPr>
+              <w:rFonts w:ascii="Arial" w:hAnsi="Arial" w:cs="Arial"/>
+              <w:sz w:val="24"/>
+              <w:szCs w:val="24"/>
+            </w:rPr>
+            <w:t>framework</w:t>
+          </w:r>
+          <w:proofErr w:type="spellEnd"/>
+          <w:r>
+            <w:rPr>
+              <w:rFonts w:ascii="Arial" w:hAnsi="Arial" w:cs="Arial"/>
+              <w:sz w:val="24"/>
+              <w:szCs w:val="24"/>
+            </w:rPr>
+            <w:t xml:space="preserve"> creado por Google y basado en </w:t>
+          </w:r>
+          <w:proofErr w:type="spellStart"/>
+          <w:r>
+            <w:rPr>
+              <w:rFonts w:ascii="Arial" w:hAnsi="Arial" w:cs="Arial"/>
+              <w:sz w:val="24"/>
+              <w:szCs w:val="24"/>
+            </w:rPr>
+            <w:t>flutter</w:t>
+          </w:r>
+          <w:proofErr w:type="spellEnd"/>
+          <w:r>
+            <w:rPr>
+              <w:rFonts w:ascii="Arial" w:hAnsi="Arial" w:cs="Arial"/>
+              <w:sz w:val="24"/>
+              <w:szCs w:val="24"/>
+            </w:rPr>
+            <w:t xml:space="preserve"> utilizando las librerías y estilos especificados en la biblioteca material de Google, todo con el fin de hacerlo versátil, a pesar de ser un </w:t>
+          </w:r>
+          <w:proofErr w:type="spellStart"/>
+          <w:r>
+            <w:rPr>
+              <w:rFonts w:ascii="Arial" w:hAnsi="Arial" w:cs="Arial"/>
+              <w:sz w:val="24"/>
+              <w:szCs w:val="24"/>
+            </w:rPr>
+            <w:t>framework</w:t>
+          </w:r>
+          <w:proofErr w:type="spellEnd"/>
+          <w:r>
+            <w:rPr>
+              <w:rFonts w:ascii="Arial" w:hAnsi="Arial" w:cs="Arial"/>
+              <w:sz w:val="24"/>
+              <w:szCs w:val="24"/>
+            </w:rPr>
+            <w:t xml:space="preserve"> que sigue en constante desarrollo avance rápidamente e implementa cada vez más funcionalidades que lo hacen adaptable a la demanda del mundo real, cuenta con diseño moderno y actualizado</w:t>
+          </w:r>
+          <w:r>
+            <w:rPr>
+              <w:rFonts w:ascii="Arial" w:hAnsi="Arial" w:cs="Arial"/>
+              <w:sz w:val="24"/>
+              <w:szCs w:val="24"/>
+            </w:rPr>
+            <w:t>.</w:t>
+          </w:r>
+        </w:p>
+        <w:p>
+          <w:pPr>
+            <w:jc w:val="both"/>
+            <w:rPr>
+              <w:rFonts w:ascii="Arial" w:hAnsi="Arial" w:cs="Arial"/>
+              <w:sz w:val="24"/>
+              <w:szCs w:val="24"/>
+            </w:rPr>
+          </w:pPr>
+          <w:r>
+            <w:rPr>
+              <w:rFonts w:ascii="Arial" w:hAnsi="Arial" w:cs="Arial"/>
+              <w:sz w:val="24"/>
+              <w:szCs w:val="24"/>
+            </w:rPr>
+            <w:t>A través de este entorno gráfico, el usuario puede iniciar, pausar y monitorear la simulación mediante un panel de logs en vivo (</w:t>
+          </w:r>
+          <w:proofErr w:type="spellStart"/>
+          <w:r>
+            <w:rPr>
+              <w:rFonts w:ascii="Arial" w:hAnsi="Arial" w:cs="Arial"/>
+              <w:sz w:val="24"/>
+              <w:szCs w:val="24"/>
+            </w:rPr>
+            <w:t>log_view</w:t>
+          </w:r>
+          <w:proofErr w:type="spellEnd"/>
+          <w:r>
+            <w:rPr>
+              <w:rFonts w:ascii="Arial" w:hAnsi="Arial" w:cs="Arial"/>
+              <w:sz w:val="24"/>
+              <w:szCs w:val="24"/>
+            </w:rPr>
+            <w:t>), observando cómo interactúan los productores y consumidores</w:t>
+          </w:r>
+          <w:r>
+            <w:rPr>
+              <w:rFonts w:ascii="Arial" w:hAnsi="Arial" w:cs="Arial"/>
+              <w:sz w:val="24"/>
+              <w:szCs w:val="24"/>
+            </w:rPr>
+            <w:t>.</w:t>
+          </w:r>
+        </w:p>
+        <w:p>
+          <w:pPr>
+            <w:pStyle w:val="Ttulo1"/>
+          </w:pPr>
+          <w:bookmarkStart w:id="18" w:name="_Toc227875842"/>
+          <w:r>
+            <w:t xml:space="preserve">Modelo </w:t>
+          </w:r>
+          <w:r>
+            <w:t>productor</w:t>
+          </w:r>
+          <w:r>
+            <w:t xml:space="preserve"> consumidor:</w:t>
+          </w:r>
+          <w:bookmarkEnd w:id="18"/>
         </w:p>
         <w:p>
           <w:pPr>
             <w:numPr>
               <w:ilvl w:val="0"/>
-              <w:numId w:val="3"/>
+              <w:numId w:val="5"/>
             </w:numPr>
-            <w:rPr>
-              <w:rFonts w:ascii="Arial" w:hAnsi="Arial" w:cs="Arial"/>
-              <w:sz w:val="24"/>
-              <w:szCs w:val="24"/>
-              <w:lang w:eastAsia="es-MX"/>
+            <w:jc w:val="both"/>
+            <w:rPr>
+              <w:rFonts w:ascii="Arial" w:hAnsi="Arial" w:cs="Arial"/>
+              <w:sz w:val="24"/>
+              <w:szCs w:val="24"/>
             </w:rPr>
           </w:pPr>
           <w:r>
             <w:rPr>
               <w:rFonts w:ascii="Arial" w:hAnsi="Arial" w:cs="Arial"/>
-              <w:sz w:val="24"/>
-              <w:szCs w:val="24"/>
-              <w:lang w:eastAsia="es-MX"/>
-            </w:rPr>
-            <w:t xml:space="preserve">Base de datos (stock, entregas, repartidores). </w:t>
+              <w:b/>
+              <w:bCs/>
+              <w:sz w:val="24"/>
+              <w:szCs w:val="24"/>
+            </w:rPr>
+            <w:t>Productor (comprar y </w:t>
+          </w:r>
+          <w:proofErr w:type="spellStart"/>
+          <w:r>
+            <w:rPr>
+              <w:rFonts w:ascii="Arial" w:hAnsi="Arial" w:cs="Arial"/>
+              <w:b/>
+              <w:bCs/>
+              <w:sz w:val="24"/>
+              <w:szCs w:val="24"/>
+            </w:rPr>
+            <w:t>restock</w:t>
+          </w:r>
+          <w:proofErr w:type="spellEnd"/>
+          <w:r>
+            <w:rPr>
+              <w:rFonts w:ascii="Arial" w:hAnsi="Arial" w:cs="Arial"/>
+              <w:b/>
+              <w:bCs/>
+              <w:sz w:val="24"/>
+              <w:szCs w:val="24"/>
+            </w:rPr>
+            <w:t>):</w:t>
+          </w:r>
+          <w:r>
+            <w:rPr>
+              <w:rFonts w:ascii="Arial" w:hAnsi="Arial" w:cs="Arial"/>
+              <w:sz w:val="24"/>
+              <w:szCs w:val="24"/>
+            </w:rPr>
+            <w:t> Actúan como hilos productores. En la función comprar(), se generan pedidos y entregas aleatorias para los compradores. Una vez que la entrega se valida y se registra en la base de datos, el productor "coloca" (mediante .</w:t>
+          </w:r>
+          <w:proofErr w:type="spellStart"/>
+          <w:r>
+            <w:rPr>
+              <w:rFonts w:ascii="Arial" w:hAnsi="Arial" w:cs="Arial"/>
+              <w:sz w:val="24"/>
+              <w:szCs w:val="24"/>
+            </w:rPr>
+            <w:t>put</w:t>
+          </w:r>
+          <w:proofErr w:type="spellEnd"/>
+          <w:r>
+            <w:rPr>
+              <w:rFonts w:ascii="Arial" w:hAnsi="Arial" w:cs="Arial"/>
+              <w:sz w:val="24"/>
+              <w:szCs w:val="24"/>
+            </w:rPr>
+            <w:t xml:space="preserve">()) este objeto de entrega en </w:t>
+          </w:r>
+          <w:r>
+            <w:rPr>
+              <w:rFonts w:ascii="Arial" w:hAnsi="Arial" w:cs="Arial"/>
+              <w:sz w:val="24"/>
+              <w:szCs w:val="24"/>
+            </w:rPr>
+            <w:t>la</w:t>
+          </w:r>
+          <w:r>
+            <w:rPr>
+              <w:rFonts w:ascii="Arial" w:hAnsi="Arial" w:cs="Arial"/>
+              <w:sz w:val="24"/>
+              <w:szCs w:val="24"/>
+            </w:rPr>
+            <w:t xml:space="preserve"> cola de trabajo.</w:t>
           </w:r>
         </w:p>
         <w:p>
           <w:pPr>
             <w:numPr>
               <w:ilvl w:val="0"/>
-              <w:numId w:val="3"/>
+              <w:numId w:val="5"/>
             </w:numPr>
-            <w:rPr>
-              <w:rFonts w:ascii="Arial" w:hAnsi="Arial" w:cs="Arial"/>
-              <w:sz w:val="24"/>
-              <w:szCs w:val="24"/>
-              <w:lang w:eastAsia="es-MX"/>
+            <w:jc w:val="both"/>
+            <w:rPr>
+              <w:rFonts w:ascii="Arial" w:hAnsi="Arial" w:cs="Arial"/>
+              <w:sz w:val="24"/>
+              <w:szCs w:val="24"/>
             </w:rPr>
           </w:pPr>
           <w:r>
             <w:rPr>
               <w:rFonts w:ascii="Arial" w:hAnsi="Arial" w:cs="Arial"/>
-              <w:sz w:val="24"/>
-              <w:szCs w:val="24"/>
-              <w:lang w:eastAsia="es-MX"/>
-            </w:rPr>
-            <w:t>Listas de objetos obtenidas mediante consultas.</w:t>
+              <w:b/>
+              <w:bCs/>
+              <w:sz w:val="24"/>
+              <w:szCs w:val="24"/>
+            </w:rPr>
+            <w:lastRenderedPageBreak/>
+            <w:t>Consumidor (entregar):</w:t>
+          </w:r>
+          <w:r>
+            <w:rPr>
+              <w:rFonts w:ascii="Arial" w:hAnsi="Arial" w:cs="Arial"/>
+              <w:sz w:val="24"/>
+              <w:szCs w:val="24"/>
+            </w:rPr>
+            <w:t> Actúa como el hilo consumidor. Este hilo extrae (mediante .</w:t>
+          </w:r>
+          <w:proofErr w:type="spellStart"/>
+          <w:r>
+            <w:rPr>
+              <w:rFonts w:ascii="Arial" w:hAnsi="Arial" w:cs="Arial"/>
+              <w:sz w:val="24"/>
+              <w:szCs w:val="24"/>
+            </w:rPr>
+            <w:t>get</w:t>
+          </w:r>
+          <w:proofErr w:type="spellEnd"/>
+          <w:r>
+            <w:rPr>
+              <w:rFonts w:ascii="Arial" w:hAnsi="Arial" w:cs="Arial"/>
+              <w:sz w:val="24"/>
+              <w:szCs w:val="24"/>
+            </w:rPr>
+            <w:t>()) los pedidos que están esperando en la cola. Una vez que obtiene un pedido, simula el tiempo de procesamiento, busca un repartidor disponible y le asigna la entrega para completarla. Esto permite que la recepción de compras y la asignación de repartidores trabajen a velocidades distintas sin bloquearse mutuamente.</w:t>
           </w:r>
         </w:p>
         <w:p>
           <w:pPr>
             <w:pStyle w:val="Ttulo1"/>
-            <w:rPr>
-              <w:lang w:eastAsia="es-MX"/>
-            </w:rPr>
           </w:pPr>
-          <w:bookmarkStart w:id="16" w:name="_Toc227861304"/>
-          <w:r>
-            <w:rPr>
-              <w:lang w:eastAsia="es-MX"/>
-            </w:rPr>
-            <w:t>Componentes del Sistema:</w:t>
-          </w:r>
-          <w:bookmarkEnd w:id="16"/>
+          <w:bookmarkStart w:id="19" w:name="_Toc227875843"/>
+          <w:proofErr w:type="spellStart"/>
+          <w:r>
+            <w:t>Locks</w:t>
+          </w:r>
+          <w:proofErr w:type="spellEnd"/>
+          <w:r>
+            <w:t xml:space="preserve"> y sincronización</w:t>
+          </w:r>
+          <w:bookmarkEnd w:id="19"/>
+          <w:r>
+            <w:t xml:space="preserve"> (uso de hilos concurrentes)</w:t>
+          </w:r>
         </w:p>
         <w:p>
           <w:pPr>
-            <w:rPr>
-              <w:rFonts w:ascii="Arial" w:hAnsi="Arial" w:cs="Arial"/>
-              <w:sz w:val="24"/>
-              <w:szCs w:val="24"/>
-              <w:lang w:eastAsia="es-MX"/>
+            <w:jc w:val="both"/>
+            <w:rPr>
+              <w:rFonts w:ascii="Arial" w:hAnsi="Arial" w:cs="Arial"/>
+              <w:sz w:val="24"/>
+              <w:szCs w:val="24"/>
             </w:rPr>
           </w:pPr>
           <w:r>
@@ -2858,18 +3773,57 @@
               <w:rFonts w:ascii="Arial" w:hAnsi="Arial" w:cs="Arial"/>
               <w:sz w:val="24"/>
               <w:szCs w:val="24"/>
-              <w:lang w:eastAsia="es-MX"/>
-            </w:rPr>
-            <w:t>Gestión de Inventario: Control de stock mediante un sistema de entradas (abastecimiento) y salidas (entregas).</w:t>
+            </w:rPr>
+            <w:t xml:space="preserve">El sistema no se ejecuta de forma secuencial. </w:t>
+          </w:r>
+          <w:r>
+            <w:rPr>
+              <w:rFonts w:ascii="Arial" w:hAnsi="Arial" w:cs="Arial"/>
+              <w:sz w:val="24"/>
+              <w:szCs w:val="24"/>
+            </w:rPr>
+            <w:t xml:space="preserve">Se invocan hilos distintos para realizar diversas tareas independientes que </w:t>
+          </w:r>
+          <w:r>
+            <w:rPr>
+              <w:rFonts w:ascii="Arial" w:hAnsi="Arial" w:cs="Arial"/>
+              <w:sz w:val="24"/>
+              <w:szCs w:val="24"/>
+            </w:rPr>
+            <w:t>interactúan</w:t>
+          </w:r>
+          <w:r>
+            <w:rPr>
+              <w:rFonts w:ascii="Arial" w:hAnsi="Arial" w:cs="Arial"/>
+              <w:sz w:val="24"/>
+              <w:szCs w:val="24"/>
+            </w:rPr>
+            <w:t xml:space="preserve"> con recursos del sistema simultáneamente</w:t>
+          </w:r>
+          <w:r>
+            <w:rPr>
+              <w:rFonts w:ascii="Arial" w:hAnsi="Arial" w:cs="Arial"/>
+              <w:sz w:val="24"/>
+              <w:szCs w:val="24"/>
+            </w:rPr>
+            <w:t>, a</w:t>
+          </w:r>
+          <w:r>
+            <w:rPr>
+              <w:rFonts w:ascii="Arial" w:hAnsi="Arial" w:cs="Arial"/>
+              <w:sz w:val="24"/>
+              <w:szCs w:val="24"/>
+            </w:rPr>
+            <w:t>l invocarse, estos se ejecutan en paralelo simulando un entorno real, gestionados de forma concurrente por el sistema operativo.</w:t>
           </w:r>
         </w:p>
         <w:p>
           <w:pPr>
-            <w:rPr>
-              <w:rFonts w:ascii="Arial" w:hAnsi="Arial" w:cs="Arial"/>
-              <w:sz w:val="24"/>
-              <w:szCs w:val="24"/>
-              <w:lang w:eastAsia="es-MX"/>
+            <w:jc w:val="both"/>
+            <w:rPr>
+              <w:rFonts w:ascii="Arial" w:hAnsi="Arial" w:cs="Arial"/>
+              <w:sz w:val="24"/>
+              <w:szCs w:val="24"/>
             </w:rPr>
           </w:pPr>
           <w:r>
@@ -2877,18 +3831,95 @@
               <w:rFonts w:ascii="Arial" w:hAnsi="Arial" w:cs="Arial"/>
               <w:sz w:val="24"/>
               <w:szCs w:val="24"/>
-              <w:lang w:eastAsia="es-MX"/>
-            </w:rPr>
-            <w:t>Módulo de Actores: Registro y control de Productores, Compradores y Repartidores.</w:t>
+            </w:rPr>
+            <w:t xml:space="preserve">Se hace uso de </w:t>
+          </w:r>
+          <w:proofErr w:type="spellStart"/>
+          <w:r>
+            <w:rPr>
+              <w:rFonts w:ascii="Arial" w:hAnsi="Arial" w:cs="Arial"/>
+              <w:sz w:val="24"/>
+              <w:szCs w:val="24"/>
+            </w:rPr>
+            <w:t>Locks</w:t>
+          </w:r>
+          <w:proofErr w:type="spellEnd"/>
+          <w:r>
+            <w:rPr>
+              <w:rFonts w:ascii="Arial" w:hAnsi="Arial" w:cs="Arial"/>
+              <w:sz w:val="24"/>
+              <w:szCs w:val="24"/>
+            </w:rPr>
+            <w:t xml:space="preserve"> en partes estratégicas dentro del sistema, en primer lugar se utilizan </w:t>
+          </w:r>
+          <w:proofErr w:type="spellStart"/>
+          <w:r>
+            <w:rPr>
+              <w:rFonts w:ascii="Arial" w:hAnsi="Arial" w:cs="Arial"/>
+              <w:sz w:val="24"/>
+              <w:szCs w:val="24"/>
+            </w:rPr>
+            <w:t>locks</w:t>
+          </w:r>
+          <w:proofErr w:type="spellEnd"/>
+          <w:r>
+            <w:rPr>
+              <w:rFonts w:ascii="Arial" w:hAnsi="Arial" w:cs="Arial"/>
+              <w:sz w:val="24"/>
+              <w:szCs w:val="24"/>
+            </w:rPr>
+            <w:t xml:space="preserve"> para bloquear el acceso de otros hilos a recursos compartidos como la base de datos, de igual manera se </w:t>
+          </w:r>
+          <w:r>
+            <w:rPr>
+              <w:rFonts w:ascii="Arial" w:hAnsi="Arial" w:cs="Arial"/>
+              <w:sz w:val="24"/>
+              <w:szCs w:val="24"/>
+            </w:rPr>
+            <w:t>usó</w:t>
+          </w:r>
+          <w:r>
+            <w:rPr>
+              <w:rFonts w:ascii="Arial" w:hAnsi="Arial" w:cs="Arial"/>
+              <w:sz w:val="24"/>
+              <w:szCs w:val="24"/>
+            </w:rPr>
+            <w:t xml:space="preserve"> de </w:t>
+          </w:r>
+          <w:proofErr w:type="spellStart"/>
+          <w:r>
+            <w:rPr>
+              <w:rFonts w:ascii="Arial" w:hAnsi="Arial" w:cs="Arial"/>
+              <w:sz w:val="24"/>
+              <w:szCs w:val="24"/>
+            </w:rPr>
+            <w:t>locks</w:t>
+          </w:r>
+          <w:proofErr w:type="spellEnd"/>
+          <w:r>
+            <w:rPr>
+              <w:rFonts w:ascii="Arial" w:hAnsi="Arial" w:cs="Arial"/>
+              <w:sz w:val="24"/>
+              <w:szCs w:val="24"/>
+            </w:rPr>
+            <w:t xml:space="preserve"> para actualizar adecuadamente la interfaz </w:t>
+          </w:r>
+          <w:r>
+            <w:rPr>
+              <w:rFonts w:ascii="Arial" w:hAnsi="Arial" w:cs="Arial"/>
+              <w:sz w:val="24"/>
+              <w:szCs w:val="24"/>
+            </w:rPr>
+            <w:tab/>
           </w:r>
         </w:p>
         <w:p>
           <w:pPr>
-            <w:rPr>
-              <w:rFonts w:ascii="Arial" w:hAnsi="Arial" w:cs="Arial"/>
-              <w:sz w:val="24"/>
-              <w:szCs w:val="24"/>
-              <w:lang w:eastAsia="es-MX"/>
+            <w:jc w:val="both"/>
+            <w:rPr>
+              <w:rFonts w:ascii="Arial" w:hAnsi="Arial" w:cs="Arial"/>
+              <w:sz w:val="24"/>
+              <w:szCs w:val="24"/>
             </w:rPr>
           </w:pPr>
           <w:r>
@@ -2896,28 +3927,749 @@
               <w:rFonts w:ascii="Arial" w:hAnsi="Arial" w:cs="Arial"/>
               <w:sz w:val="24"/>
               <w:szCs w:val="24"/>
-              <w:lang w:eastAsia="es-MX"/>
-            </w:rPr>
-            <w:t>Sistema de Entregas: Gestión de pedidos complejos donde una entrega puede contener múltiples productos (relación maestro-detalle).</w:t>
+            </w:rPr>
+            <w:t>En las funciones comprar, entregar y </w:t>
+          </w:r>
+          <w:proofErr w:type="spellStart"/>
+          <w:r>
+            <w:rPr>
+              <w:rFonts w:ascii="Arial" w:hAnsi="Arial" w:cs="Arial"/>
+              <w:sz w:val="24"/>
+              <w:szCs w:val="24"/>
+            </w:rPr>
+            <w:t>restock</w:t>
+          </w:r>
+          <w:proofErr w:type="spellEnd"/>
+          <w:r>
+            <w:rPr>
+              <w:rFonts w:ascii="Arial" w:hAnsi="Arial" w:cs="Arial"/>
+              <w:sz w:val="24"/>
+              <w:szCs w:val="24"/>
+            </w:rPr>
+            <w:t>, las operaciones de escritura a la base de datos se envolvieron dentro de un bloque </w:t>
+          </w:r>
+          <w:proofErr w:type="spellStart"/>
+          <w:r>
+            <w:rPr>
+              <w:rFonts w:ascii="Arial" w:hAnsi="Arial" w:cs="Arial"/>
+              <w:sz w:val="24"/>
+              <w:szCs w:val="24"/>
+            </w:rPr>
+            <w:t>with</w:t>
+          </w:r>
+          <w:proofErr w:type="spellEnd"/>
+          <w:r>
+            <w:rPr>
+              <w:rFonts w:ascii="Arial" w:hAnsi="Arial" w:cs="Arial"/>
+              <w:sz w:val="24"/>
+              <w:szCs w:val="24"/>
+            </w:rPr>
+            <w:t xml:space="preserve"> </w:t>
+          </w:r>
+          <w:proofErr w:type="spellStart"/>
+          <w:r>
+            <w:rPr>
+              <w:rFonts w:ascii="Arial" w:hAnsi="Arial" w:cs="Arial"/>
+              <w:sz w:val="24"/>
+              <w:szCs w:val="24"/>
+            </w:rPr>
+            <w:t>lock</w:t>
+          </w:r>
+          <w:proofErr w:type="spellEnd"/>
+          <w:r>
+            <w:rPr>
+              <w:rFonts w:ascii="Arial" w:hAnsi="Arial" w:cs="Arial"/>
+              <w:sz w:val="24"/>
+              <w:szCs w:val="24"/>
+            </w:rPr>
+            <w:t>. Esto asegura que si el Hilo A está escribiendo una nueva entrega, el Hilo B debe esperar a que el Hilo A termine y libere el </w:t>
+          </w:r>
+          <w:proofErr w:type="spellStart"/>
+          <w:r>
+            <w:rPr>
+              <w:rFonts w:ascii="Arial" w:hAnsi="Arial" w:cs="Arial"/>
+              <w:sz w:val="24"/>
+              <w:szCs w:val="24"/>
+            </w:rPr>
+            <w:t>Lock</w:t>
+          </w:r>
+          <w:proofErr w:type="spellEnd"/>
+          <w:r>
+            <w:rPr>
+              <w:rFonts w:ascii="Arial" w:hAnsi="Arial" w:cs="Arial"/>
+              <w:sz w:val="24"/>
+              <w:szCs w:val="24"/>
+            </w:rPr>
+            <w:t> antes de poder interactuar con la base de datos.</w:t>
           </w:r>
         </w:p>
         <w:p>
           <w:pPr>
-            <w:rPr>
-              <w:rFonts w:ascii="Arial" w:hAnsi="Arial" w:cs="Arial"/>
-              <w:sz w:val="24"/>
-              <w:szCs w:val="24"/>
-              <w:lang w:eastAsia="es-MX"/>
-            </w:rPr>
+            <w:pStyle w:val="Ttulo1"/>
           </w:pPr>
-          <w:r>
-            <w:rPr>
-              <w:rFonts w:ascii="Arial" w:hAnsi="Arial" w:cs="Arial"/>
-              <w:sz w:val="24"/>
-              <w:szCs w:val="24"/>
-              <w:lang w:eastAsia="es-MX"/>
-            </w:rPr>
-            <w:t>Logística de Reparto: Control de disponibilidad de repartidores en tiempo real.</w:t>
+          <w:bookmarkStart w:id="20" w:name="_Toc227875844"/>
+          <w:r>
+            <w:t>Medición de rendimiento</w:t>
+          </w:r>
+          <w:bookmarkEnd w:id="20"/>
+        </w:p>
+        <w:p>
+          <w:pPr>
+            <w:jc w:val="both"/>
+            <w:rPr>
+              <w:rFonts w:ascii="Arial" w:hAnsi="Arial" w:cs="Arial"/>
+              <w:sz w:val="24"/>
+              <w:szCs w:val="24"/>
+            </w:rPr>
+          </w:pPr>
+          <w:r>
+            <w:rPr>
+              <w:rFonts w:ascii="Arial" w:hAnsi="Arial" w:cs="Arial"/>
+              <w:sz w:val="24"/>
+              <w:szCs w:val="24"/>
+            </w:rPr>
+            <w:t>Para la medición de rendimiento del sistema, se utilizó la función </w:t>
+          </w:r>
+          <w:proofErr w:type="spellStart"/>
+          <w:r>
+            <w:rPr>
+              <w:rFonts w:ascii="Arial" w:hAnsi="Arial" w:cs="Arial"/>
+              <w:sz w:val="24"/>
+              <w:szCs w:val="24"/>
+            </w:rPr>
+            <w:t>time.perf_counter</w:t>
+          </w:r>
+          <w:proofErr w:type="spellEnd"/>
+          <w:r>
+            <w:rPr>
+              <w:rFonts w:ascii="Arial" w:hAnsi="Arial" w:cs="Arial"/>
+              <w:sz w:val="24"/>
+              <w:szCs w:val="24"/>
+            </w:rPr>
+            <w:t xml:space="preserve">() de </w:t>
+          </w:r>
+          <w:proofErr w:type="spellStart"/>
+          <w:r>
+            <w:rPr>
+              <w:rFonts w:ascii="Arial" w:hAnsi="Arial" w:cs="Arial"/>
+              <w:sz w:val="24"/>
+              <w:szCs w:val="24"/>
+            </w:rPr>
+            <w:t>p</w:t>
+          </w:r>
+          <w:r>
+            <w:rPr>
+              <w:rFonts w:ascii="Arial" w:hAnsi="Arial" w:cs="Arial"/>
+              <w:sz w:val="24"/>
+              <w:szCs w:val="24"/>
+            </w:rPr>
+            <w:t>ython</w:t>
+          </w:r>
+          <w:proofErr w:type="spellEnd"/>
+          <w:r>
+            <w:rPr>
+              <w:rFonts w:ascii="Arial" w:hAnsi="Arial" w:cs="Arial"/>
+              <w:sz w:val="24"/>
+              <w:szCs w:val="24"/>
+            </w:rPr>
+            <w:t>, la cual ofrece un reloj de alta resolución ideal para medir intervalos de tiempo de ejecución. Se tomó una marca de tiempo al iniciar el ciclo de hilos (inicio) y otra al finalizar (fin). La diferencia entre ambas nos da el tiempo exacto que le tomó al programa despachar todas las tareas concurrentes, lo cual se registra en los logs del sistema.</w:t>
+          </w:r>
+        </w:p>
+        <w:p>
+          <w:pPr>
+            <w:jc w:val="both"/>
+            <w:rPr>
+              <w:rFonts w:ascii="Arial" w:hAnsi="Arial" w:cs="Arial"/>
+              <w:sz w:val="24"/>
+              <w:szCs w:val="24"/>
+            </w:rPr>
+          </w:pPr>
+          <w:r>
+            <w:rPr>
+              <w:rFonts w:ascii="Arial" w:hAnsi="Arial" w:cs="Arial"/>
+              <w:sz w:val="24"/>
+              <w:szCs w:val="24"/>
+            </w:rPr>
+            <w:t xml:space="preserve">Al </w:t>
+          </w:r>
+          <w:r>
+            <w:rPr>
+              <w:rFonts w:ascii="Arial" w:hAnsi="Arial" w:cs="Arial"/>
+              <w:sz w:val="24"/>
+              <w:szCs w:val="24"/>
+            </w:rPr>
+            <w:t>inicio de</w:t>
+          </w:r>
+          <w:r>
+            <w:rPr>
+              <w:rFonts w:ascii="Arial" w:hAnsi="Arial" w:cs="Arial"/>
+              <w:sz w:val="24"/>
+              <w:szCs w:val="24"/>
+            </w:rPr>
+            <w:t xml:space="preserve"> la </w:t>
+          </w:r>
+          <w:r>
+            <w:rPr>
+              <w:rFonts w:ascii="Arial" w:hAnsi="Arial" w:cs="Arial"/>
+              <w:sz w:val="24"/>
+              <w:szCs w:val="24"/>
+            </w:rPr>
+            <w:t>función</w:t>
+          </w:r>
+          <w:r>
+            <w:rPr>
+              <w:rFonts w:ascii="Arial" w:hAnsi="Arial" w:cs="Arial"/>
+              <w:sz w:val="24"/>
+              <w:szCs w:val="24"/>
+            </w:rPr>
+            <w:t> </w:t>
+          </w:r>
+          <w:proofErr w:type="spellStart"/>
+          <w:r>
+            <w:rPr>
+              <w:rFonts w:ascii="Arial" w:hAnsi="Arial" w:cs="Arial"/>
+              <w:sz w:val="24"/>
+              <w:szCs w:val="24"/>
+            </w:rPr>
+            <w:t>start</w:t>
+          </w:r>
+          <w:proofErr w:type="spellEnd"/>
+          <w:r>
+            <w:rPr>
+              <w:rFonts w:ascii="Arial" w:hAnsi="Arial" w:cs="Arial"/>
+              <w:sz w:val="24"/>
+              <w:szCs w:val="24"/>
+            </w:rPr>
+            <w:t xml:space="preserve">() de la simulación se captura la marca de tiempo inicio. Una vez que el ciclo de </w:t>
+          </w:r>
+          <w:r>
+            <w:rPr>
+              <w:rFonts w:ascii="Arial" w:hAnsi="Arial" w:cs="Arial"/>
+              <w:sz w:val="24"/>
+              <w:szCs w:val="24"/>
+            </w:rPr>
+            <w:t xml:space="preserve">la simulación termina o se interrumpe por el usuario </w:t>
+          </w:r>
+          <w:r>
+            <w:rPr>
+              <w:rFonts w:ascii="Arial" w:hAnsi="Arial" w:cs="Arial"/>
+              <w:sz w:val="24"/>
+              <w:szCs w:val="24"/>
+            </w:rPr>
+            <w:t>se captura el tiempo fin</w:t>
+          </w:r>
+          <w:r>
+            <w:rPr>
+              <w:rFonts w:ascii="Arial" w:hAnsi="Arial" w:cs="Arial"/>
+              <w:sz w:val="24"/>
+              <w:szCs w:val="24"/>
+            </w:rPr>
+            <w:t>al</w:t>
+          </w:r>
+          <w:r>
+            <w:rPr>
+              <w:rFonts w:ascii="Arial" w:hAnsi="Arial" w:cs="Arial"/>
+              <w:sz w:val="24"/>
+              <w:szCs w:val="24"/>
+            </w:rPr>
+            <w:t>.</w:t>
+          </w:r>
+          <w:r>
+            <w:rPr>
+              <w:rFonts w:ascii="Arial" w:hAnsi="Arial" w:cs="Arial"/>
+              <w:sz w:val="24"/>
+              <w:szCs w:val="24"/>
+            </w:rPr>
+            <w:t xml:space="preserve"> Finalmente los logs muestran el tiempo calculado, </w:t>
+          </w:r>
+          <w:r>
+            <w:rPr>
+              <w:rFonts w:ascii="Arial" w:hAnsi="Arial" w:cs="Arial"/>
+              <w:sz w:val="24"/>
+              <w:szCs w:val="24"/>
+            </w:rPr>
+            <w:t xml:space="preserve"> </w:t>
+          </w:r>
+          <w:r>
+            <w:rPr>
+              <w:rFonts w:ascii="Arial" w:hAnsi="Arial" w:cs="Arial"/>
+              <w:sz w:val="24"/>
+              <w:szCs w:val="24"/>
+            </w:rPr>
+            <w:t>evalua</w:t>
+          </w:r>
+          <w:r>
+            <w:rPr>
+              <w:rFonts w:ascii="Arial" w:hAnsi="Arial" w:cs="Arial"/>
+              <w:sz w:val="24"/>
+              <w:szCs w:val="24"/>
+            </w:rPr>
+            <w:t>ndo el tiempo que le toma al sistema para</w:t>
+          </w:r>
+          <w:r>
+            <w:rPr>
+              <w:rFonts w:ascii="Arial" w:hAnsi="Arial" w:cs="Arial"/>
+              <w:sz w:val="24"/>
+              <w:szCs w:val="24"/>
+            </w:rPr>
+            <w:t xml:space="preserve"> procesar el lote completo de hilos y operaciones</w:t>
+          </w:r>
+          <w:r>
+            <w:rPr>
+              <w:rFonts w:ascii="Arial" w:hAnsi="Arial" w:cs="Arial"/>
+              <w:sz w:val="24"/>
+              <w:szCs w:val="24"/>
+            </w:rPr>
+            <w:t>.</w:t>
+          </w:r>
+        </w:p>
+        <w:p>
+          <w:pPr>
+            <w:pStyle w:val="Ttulo1"/>
+          </w:pPr>
+          <w:bookmarkStart w:id="21" w:name="_Toc227875845"/>
+          <w:r>
+            <w:t xml:space="preserve">Cola </w:t>
+          </w:r>
+          <w:proofErr w:type="spellStart"/>
+          <w:r>
+            <w:t>q</w:t>
+          </w:r>
+          <w:r>
+            <w:t>ueue</w:t>
+          </w:r>
+          <w:bookmarkEnd w:id="21"/>
+          <w:proofErr w:type="spellEnd"/>
+        </w:p>
+        <w:p>
+          <w:pPr>
+            <w:jc w:val="both"/>
+            <w:rPr>
+              <w:rFonts w:ascii="Arial" w:hAnsi="Arial" w:cs="Arial"/>
+              <w:sz w:val="24"/>
+              <w:szCs w:val="24"/>
+            </w:rPr>
+          </w:pPr>
+          <w:r>
+            <w:rPr>
+              <w:rFonts w:ascii="Arial" w:hAnsi="Arial" w:cs="Arial"/>
+              <w:sz w:val="24"/>
+              <w:szCs w:val="24"/>
+            </w:rPr>
+            <w:t>SE hace uso de una cola como un recurso compartido entre hilos algunos hilos se encargan de almacenar en la cola referencias a la base de datos</w:t>
+          </w:r>
+          <w:r>
+            <w:rPr>
+              <w:rFonts w:ascii="Arial" w:hAnsi="Arial" w:cs="Arial"/>
+              <w:sz w:val="24"/>
+              <w:szCs w:val="24"/>
+            </w:rPr>
+            <w:t xml:space="preserve"> (</w:t>
+          </w:r>
+          <w:r>
+            <w:rPr>
+              <w:rFonts w:ascii="Arial" w:hAnsi="Arial" w:cs="Arial"/>
+              <w:sz w:val="24"/>
+              <w:szCs w:val="24"/>
+            </w:rPr>
+            <w:t>utilizando la librería nativa de Python: </w:t>
+          </w:r>
+          <w:proofErr w:type="spellStart"/>
+          <w:r>
+            <w:rPr>
+              <w:rFonts w:ascii="Arial" w:hAnsi="Arial" w:cs="Arial"/>
+              <w:sz w:val="24"/>
+              <w:szCs w:val="24"/>
+            </w:rPr>
+            <w:t>pending_deliveries</w:t>
+          </w:r>
+          <w:proofErr w:type="spellEnd"/>
+          <w:r>
+            <w:rPr>
+              <w:rFonts w:ascii="Arial" w:hAnsi="Arial" w:cs="Arial"/>
+              <w:sz w:val="24"/>
+              <w:szCs w:val="24"/>
+            </w:rPr>
+            <w:t xml:space="preserve"> = </w:t>
+          </w:r>
+          <w:proofErr w:type="spellStart"/>
+          <w:r>
+            <w:rPr>
+              <w:rFonts w:ascii="Arial" w:hAnsi="Arial" w:cs="Arial"/>
+              <w:sz w:val="24"/>
+              <w:szCs w:val="24"/>
+            </w:rPr>
+            <w:t>queue.Queue</w:t>
+          </w:r>
+          <w:proofErr w:type="spellEnd"/>
+          <w:r>
+            <w:rPr>
+              <w:rFonts w:ascii="Arial" w:hAnsi="Arial" w:cs="Arial"/>
+              <w:sz w:val="24"/>
+              <w:szCs w:val="24"/>
+            </w:rPr>
+            <w:t>()</w:t>
+          </w:r>
+          <w:r>
+            <w:rPr>
+              <w:rFonts w:ascii="Arial" w:hAnsi="Arial" w:cs="Arial"/>
+              <w:sz w:val="24"/>
+              <w:szCs w:val="24"/>
+            </w:rPr>
+            <w:t>)</w:t>
+          </w:r>
+          <w:r>
+            <w:rPr>
+              <w:rFonts w:ascii="Arial" w:hAnsi="Arial" w:cs="Arial"/>
+              <w:sz w:val="24"/>
+              <w:szCs w:val="24"/>
+            </w:rPr>
+            <w:t xml:space="preserve">, mientras que otros acceden a estos de manera ordenada, todo gracias a que la cola es </w:t>
+          </w:r>
+          <w:proofErr w:type="spellStart"/>
+          <w:r>
+            <w:rPr>
+              <w:rFonts w:ascii="Arial" w:hAnsi="Arial" w:cs="Arial"/>
+              <w:sz w:val="24"/>
+              <w:szCs w:val="24"/>
+            </w:rPr>
+            <w:t>thread</w:t>
+          </w:r>
+          <w:proofErr w:type="spellEnd"/>
+          <w:r>
+            <w:rPr>
+              <w:rFonts w:ascii="Arial" w:hAnsi="Arial" w:cs="Arial"/>
+              <w:sz w:val="24"/>
+              <w:szCs w:val="24"/>
+            </w:rPr>
+            <w:t xml:space="preserve"> </w:t>
+          </w:r>
+          <w:proofErr w:type="spellStart"/>
+          <w:r>
+            <w:rPr>
+              <w:rFonts w:ascii="Arial" w:hAnsi="Arial" w:cs="Arial"/>
+              <w:sz w:val="24"/>
+              <w:szCs w:val="24"/>
+            </w:rPr>
+            <w:t>safe</w:t>
+          </w:r>
+          <w:proofErr w:type="spellEnd"/>
+          <w:r>
+            <w:rPr>
+              <w:rFonts w:ascii="Arial" w:hAnsi="Arial" w:cs="Arial"/>
+              <w:sz w:val="24"/>
+              <w:szCs w:val="24"/>
+            </w:rPr>
+            <w:t xml:space="preserve"> por lo cual no es necesario el uso de </w:t>
+          </w:r>
+          <w:proofErr w:type="spellStart"/>
+          <w:r>
+            <w:rPr>
+              <w:rFonts w:ascii="Arial" w:hAnsi="Arial" w:cs="Arial"/>
+              <w:sz w:val="24"/>
+              <w:szCs w:val="24"/>
+            </w:rPr>
+            <w:t>locks</w:t>
+          </w:r>
+          <w:proofErr w:type="spellEnd"/>
+          <w:r>
+            <w:rPr>
+              <w:rFonts w:ascii="Arial" w:hAnsi="Arial" w:cs="Arial"/>
+              <w:sz w:val="24"/>
+              <w:szCs w:val="24"/>
+            </w:rPr>
+            <w:t xml:space="preserve">, </w:t>
+          </w:r>
+          <w:r>
+            <w:rPr>
+              <w:rFonts w:ascii="Arial" w:hAnsi="Arial" w:cs="Arial"/>
+              <w:sz w:val="24"/>
+              <w:szCs w:val="24"/>
+            </w:rPr>
+            <w:t>internamente ya maneja sus propios mecanismos de bloqueo, asegurando que si dos hilos intentan hacer .</w:t>
+          </w:r>
+          <w:proofErr w:type="spellStart"/>
+          <w:r>
+            <w:rPr>
+              <w:rFonts w:ascii="Arial" w:hAnsi="Arial" w:cs="Arial"/>
+              <w:sz w:val="24"/>
+              <w:szCs w:val="24"/>
+            </w:rPr>
+            <w:t>put</w:t>
+          </w:r>
+          <w:proofErr w:type="spellEnd"/>
+          <w:r>
+            <w:rPr>
+              <w:rFonts w:ascii="Arial" w:hAnsi="Arial" w:cs="Arial"/>
+              <w:sz w:val="24"/>
+              <w:szCs w:val="24"/>
+            </w:rPr>
+            <w:t>() o .</w:t>
+          </w:r>
+          <w:proofErr w:type="spellStart"/>
+          <w:r>
+            <w:rPr>
+              <w:rFonts w:ascii="Arial" w:hAnsi="Arial" w:cs="Arial"/>
+              <w:sz w:val="24"/>
+              <w:szCs w:val="24"/>
+            </w:rPr>
+            <w:t>get</w:t>
+          </w:r>
+          <w:proofErr w:type="spellEnd"/>
+          <w:r>
+            <w:rPr>
+              <w:rFonts w:ascii="Arial" w:hAnsi="Arial" w:cs="Arial"/>
+              <w:sz w:val="24"/>
+              <w:szCs w:val="24"/>
+            </w:rPr>
+            <w:t>() exactamente en el mismo milisegundo, la cola no se corrompa ni se pierdan datos</w:t>
+          </w:r>
+          <w:r>
+            <w:rPr>
+              <w:rFonts w:ascii="Arial" w:hAnsi="Arial" w:cs="Arial"/>
+              <w:sz w:val="24"/>
+              <w:szCs w:val="24"/>
+            </w:rPr>
+            <w:t>, esto es especialmente útil</w:t>
+          </w:r>
+          <w:r>
+            <w:rPr>
+              <w:rFonts w:ascii="Arial" w:hAnsi="Arial" w:cs="Arial"/>
+              <w:sz w:val="24"/>
+              <w:szCs w:val="24"/>
+            </w:rPr>
+            <w:t xml:space="preserve"> para protegerla de problemas como la condición carrera</w:t>
+          </w:r>
+          <w:r>
+            <w:rPr>
+              <w:rFonts w:ascii="Arial" w:hAnsi="Arial" w:cs="Arial"/>
+              <w:sz w:val="24"/>
+              <w:szCs w:val="24"/>
+            </w:rPr>
+            <w:t xml:space="preserve">, </w:t>
+          </w:r>
+          <w:r>
+            <w:rPr>
+              <w:rFonts w:ascii="Arial" w:hAnsi="Arial" w:cs="Arial"/>
+              <w:sz w:val="24"/>
+              <w:szCs w:val="24"/>
+            </w:rPr>
+            <w:t>abstrayendo gran parte de la complejidad de la</w:t>
+          </w:r>
+          <w:r>
+            <w:rPr>
+              <w:rFonts w:ascii="Arial" w:hAnsi="Arial" w:cs="Arial"/>
+              <w:sz w:val="24"/>
+              <w:szCs w:val="24"/>
+            </w:rPr>
+            <w:t xml:space="preserve"> simulación </w:t>
+          </w:r>
+          <w:r>
+            <w:rPr>
+              <w:rFonts w:ascii="Arial" w:hAnsi="Arial" w:cs="Arial"/>
+              <w:sz w:val="24"/>
+              <w:szCs w:val="24"/>
+            </w:rPr>
+            <w:t xml:space="preserve">. En el caso </w:t>
+          </w:r>
+          <w:r>
+            <w:rPr>
+              <w:rFonts w:ascii="Arial" w:hAnsi="Arial" w:cs="Arial"/>
+              <w:sz w:val="24"/>
+              <w:szCs w:val="24"/>
+            </w:rPr>
+            <w:t>específico</w:t>
+          </w:r>
+          <w:r>
+            <w:rPr>
+              <w:rFonts w:ascii="Arial" w:hAnsi="Arial" w:cs="Arial"/>
+              <w:sz w:val="24"/>
+              <w:szCs w:val="24"/>
+            </w:rPr>
+            <w:t xml:space="preserve"> del sistema la cual simula el flujo de pedidos, gracias al paradigm</w:t>
+          </w:r>
+          <w:r>
+            <w:rPr>
+              <w:rFonts w:ascii="Arial" w:hAnsi="Arial" w:cs="Arial"/>
+              <w:sz w:val="24"/>
+              <w:szCs w:val="24"/>
+            </w:rPr>
+            <w:t>a</w:t>
+          </w:r>
+          <w:r>
+            <w:rPr>
+              <w:rFonts w:ascii="Arial" w:hAnsi="Arial" w:cs="Arial"/>
+              <w:sz w:val="24"/>
+              <w:szCs w:val="24"/>
+            </w:rPr>
+            <w:t xml:space="preserve"> de FIFO (</w:t>
+          </w:r>
+          <w:proofErr w:type="spellStart"/>
+          <w:r>
+            <w:rPr>
+              <w:rFonts w:ascii="Arial" w:hAnsi="Arial" w:cs="Arial"/>
+              <w:sz w:val="24"/>
+              <w:szCs w:val="24"/>
+            </w:rPr>
+            <w:t>first</w:t>
+          </w:r>
+          <w:proofErr w:type="spellEnd"/>
+          <w:r>
+            <w:rPr>
+              <w:rFonts w:ascii="Arial" w:hAnsi="Arial" w:cs="Arial"/>
+              <w:sz w:val="24"/>
+              <w:szCs w:val="24"/>
+            </w:rPr>
+            <w:t xml:space="preserve"> in </w:t>
+          </w:r>
+          <w:proofErr w:type="spellStart"/>
+          <w:r>
+            <w:rPr>
+              <w:rFonts w:ascii="Arial" w:hAnsi="Arial" w:cs="Arial"/>
+              <w:sz w:val="24"/>
+              <w:szCs w:val="24"/>
+            </w:rPr>
+            <w:t>first</w:t>
+          </w:r>
+          <w:proofErr w:type="spellEnd"/>
+          <w:r>
+            <w:rPr>
+              <w:rFonts w:ascii="Arial" w:hAnsi="Arial" w:cs="Arial"/>
+              <w:sz w:val="24"/>
+              <w:szCs w:val="24"/>
+            </w:rPr>
+            <w:t xml:space="preserve"> </w:t>
+          </w:r>
+          <w:proofErr w:type="spellStart"/>
+          <w:r>
+            <w:rPr>
+              <w:rFonts w:ascii="Arial" w:hAnsi="Arial" w:cs="Arial"/>
+              <w:sz w:val="24"/>
+              <w:szCs w:val="24"/>
+            </w:rPr>
+            <w:t>out</w:t>
+          </w:r>
+          <w:proofErr w:type="spellEnd"/>
+          <w:r>
+            <w:rPr>
+              <w:rFonts w:ascii="Arial" w:hAnsi="Arial" w:cs="Arial"/>
+              <w:sz w:val="24"/>
+              <w:szCs w:val="24"/>
+            </w:rPr>
+            <w:t xml:space="preserve">) permitiendo replicar </w:t>
+          </w:r>
+          <w:r>
+            <w:rPr>
+              <w:rFonts w:ascii="Arial" w:hAnsi="Arial" w:cs="Arial"/>
+              <w:sz w:val="24"/>
+              <w:szCs w:val="24"/>
+            </w:rPr>
+            <w:lastRenderedPageBreak/>
+            <w:t>exactamente el funcionamiento del flujo en el cual se atienden las ordenes o los pedidos de un sistema real</w:t>
+          </w:r>
+          <w:r>
+            <w:rPr>
+              <w:rFonts w:ascii="Arial" w:hAnsi="Arial" w:cs="Arial"/>
+              <w:sz w:val="24"/>
+              <w:szCs w:val="24"/>
+            </w:rPr>
+            <w:t>.</w:t>
+          </w:r>
+          <w:r>
+            <w:rPr>
+              <w:rFonts w:ascii="Arial" w:hAnsi="Arial" w:cs="Arial"/>
+              <w:sz w:val="24"/>
+              <w:szCs w:val="24"/>
+            </w:rPr>
+            <w:t xml:space="preserve"> </w:t>
+          </w:r>
+        </w:p>
+        <w:p>
+          <w:pPr>
+            <w:pStyle w:val="Ttulo1"/>
+          </w:pPr>
+          <w:bookmarkStart w:id="22" w:name="_Toc227875846"/>
+          <w:r>
+            <w:t>Funcionamiento</w:t>
+          </w:r>
+          <w:bookmarkEnd w:id="22"/>
+        </w:p>
+        <w:p>
+          <w:pPr>
+            <w:jc w:val="both"/>
+            <w:rPr>
+              <w:rFonts w:ascii="Arial" w:hAnsi="Arial" w:cs="Arial"/>
+              <w:sz w:val="24"/>
+              <w:szCs w:val="24"/>
+            </w:rPr>
+          </w:pPr>
+          <w:r>
+            <w:rPr>
+              <w:rFonts w:ascii="Arial" w:hAnsi="Arial" w:cs="Arial"/>
+              <w:sz w:val="24"/>
+              <w:szCs w:val="24"/>
+            </w:rPr>
+            <w:t>El sistema cuenta con algunas características, en primer lugar están las vistas de productos, repartidores, proveedores, clientes, entradas y ventas que muestran el contenido de la base de datos, junto con operaciones de CRUD integradas en la interfaz. Por otro lado se encuentra el funcionamiento del sistema a través de la simulación</w:t>
+          </w:r>
+        </w:p>
+        <w:p>
+          <w:pPr>
+            <w:jc w:val="both"/>
+            <w:rPr>
+              <w:rFonts w:ascii="Arial" w:hAnsi="Arial" w:cs="Arial"/>
+              <w:sz w:val="24"/>
+              <w:szCs w:val="24"/>
+            </w:rPr>
+          </w:pPr>
+          <w:r>
+            <w:rPr>
+              <w:rFonts w:ascii="Arial" w:hAnsi="Arial" w:cs="Arial"/>
+              <w:sz w:val="24"/>
+              <w:szCs w:val="24"/>
+            </w:rPr>
+            <w:t xml:space="preserve">Que </w:t>
+          </w:r>
+          <w:r>
+            <w:rPr>
+              <w:rFonts w:ascii="Arial" w:hAnsi="Arial" w:cs="Arial"/>
+              <w:sz w:val="24"/>
+              <w:szCs w:val="24"/>
+            </w:rPr>
+            <w:t>activa un administrador que genera hilos productores y consumidores. Los hilos se comunican de forma segura a través de una cola y siempre que necesitan modificar el inventario o registrar una venta, solicitan acceso exclusivo mediante un </w:t>
+          </w:r>
+          <w:proofErr w:type="spellStart"/>
+          <w:r>
+            <w:rPr>
+              <w:rFonts w:ascii="Arial" w:hAnsi="Arial" w:cs="Arial"/>
+              <w:sz w:val="24"/>
+              <w:szCs w:val="24"/>
+            </w:rPr>
+            <w:t>Lock</w:t>
+          </w:r>
+          <w:proofErr w:type="spellEnd"/>
+          <w:r>
+            <w:rPr>
+              <w:rFonts w:ascii="Arial" w:hAnsi="Arial" w:cs="Arial"/>
+              <w:sz w:val="24"/>
+              <w:szCs w:val="24"/>
+            </w:rPr>
+            <w:t xml:space="preserve"> para guardar </w:t>
+          </w:r>
+          <w:r>
+            <w:rPr>
+              <w:rFonts w:ascii="Arial" w:hAnsi="Arial" w:cs="Arial"/>
+              <w:sz w:val="24"/>
+              <w:szCs w:val="24"/>
+            </w:rPr>
+            <w:t xml:space="preserve">registros en </w:t>
+          </w:r>
+          <w:r>
+            <w:rPr>
+              <w:rFonts w:ascii="Arial" w:hAnsi="Arial" w:cs="Arial"/>
+              <w:sz w:val="24"/>
+              <w:szCs w:val="24"/>
+            </w:rPr>
+            <w:t>SQLite. Todo el proceso ocurre en tiempo real y, gracias a la concurrencia, el programa funciona sin pausas, bloqueos de interfaz ni caída por saturación de recursos, arrojando al final los datos de medición de rendimiento correspondientes.</w:t>
           </w:r>
         </w:p>
         <w:p>
@@ -2927,14 +4679,351 @@
               <w:lang w:eastAsia="es-MX"/>
             </w:rPr>
           </w:pPr>
-          <w:bookmarkStart w:id="17" w:name="_Toc227861305"/>
+          <w:bookmarkStart w:id="23" w:name="_Toc227875847"/>
           <w:r>
             <w:rPr>
               <w:lang w:eastAsia="es-MX"/>
             </w:rPr>
+            <w:t>Componentes del Sistema:</w:t>
+          </w:r>
+          <w:bookmarkEnd w:id="23"/>
+        </w:p>
+        <w:p>
+          <w:pPr>
+            <w:rPr>
+              <w:rFonts w:ascii="Arial" w:hAnsi="Arial" w:cs="Arial"/>
+              <w:sz w:val="24"/>
+              <w:szCs w:val="24"/>
+              <w:lang w:eastAsia="es-MX"/>
+            </w:rPr>
+          </w:pPr>
+          <w:r>
+            <w:rPr>
+              <w:rFonts w:ascii="Arial" w:hAnsi="Arial" w:cs="Arial"/>
+              <w:sz w:val="24"/>
+              <w:szCs w:val="24"/>
+              <w:lang w:eastAsia="es-MX"/>
+            </w:rPr>
+            <w:t>Gestión de Inventario: Control de stock mediante un sistema de entradas (abastecimiento) y salidas (entregas).</w:t>
+          </w:r>
+        </w:p>
+        <w:p>
+          <w:pPr>
+            <w:rPr>
+              <w:rFonts w:ascii="Arial" w:hAnsi="Arial" w:cs="Arial"/>
+              <w:sz w:val="24"/>
+              <w:szCs w:val="24"/>
+              <w:lang w:eastAsia="es-MX"/>
+            </w:rPr>
+          </w:pPr>
+          <w:r>
+            <w:rPr>
+              <w:rFonts w:ascii="Arial" w:hAnsi="Arial" w:cs="Arial"/>
+              <w:sz w:val="24"/>
+              <w:szCs w:val="24"/>
+              <w:lang w:eastAsia="es-MX"/>
+            </w:rPr>
+            <w:t>Módulo de Actores: Registro y control de Productores, Compradores y Repartidores.</w:t>
+          </w:r>
+        </w:p>
+        <w:p>
+          <w:pPr>
+            <w:rPr>
+              <w:rFonts w:ascii="Arial" w:hAnsi="Arial" w:cs="Arial"/>
+              <w:sz w:val="24"/>
+              <w:szCs w:val="24"/>
+              <w:lang w:eastAsia="es-MX"/>
+            </w:rPr>
+          </w:pPr>
+          <w:r>
+            <w:rPr>
+              <w:rFonts w:ascii="Arial" w:hAnsi="Arial" w:cs="Arial"/>
+              <w:sz w:val="24"/>
+              <w:szCs w:val="24"/>
+              <w:lang w:eastAsia="es-MX"/>
+            </w:rPr>
+            <w:t>Sistema de Entregas: Gestión de pedidos complejos donde una entrega puede contener múltiples productos (relación maestro-detalle).</w:t>
+          </w:r>
+        </w:p>
+        <w:p>
+          <w:pPr>
+            <w:rPr>
+              <w:rFonts w:ascii="Arial" w:hAnsi="Arial" w:cs="Arial"/>
+              <w:sz w:val="24"/>
+              <w:szCs w:val="24"/>
+              <w:lang w:eastAsia="es-MX"/>
+            </w:rPr>
+          </w:pPr>
+          <w:r>
+            <w:rPr>
+              <w:rFonts w:ascii="Arial" w:hAnsi="Arial" w:cs="Arial"/>
+              <w:sz w:val="24"/>
+              <w:szCs w:val="24"/>
+              <w:lang w:eastAsia="es-MX"/>
+            </w:rPr>
+            <w:t>Logística de Reparto: Control de disponibilidad de repartidores en tiempo real.</w:t>
+          </w:r>
+        </w:p>
+        <w:p>
+          <w:pPr>
+            <w:pStyle w:val="Ttulo1"/>
+            <w:rPr>
+              <w:lang w:eastAsia="es-MX"/>
+            </w:rPr>
+          </w:pPr>
+          <w:bookmarkStart w:id="24" w:name="_Toc227875848"/>
+          <w:r>
+            <w:rPr>
+              <w:lang w:eastAsia="es-MX"/>
+            </w:rPr>
+            <w:t>Base de datos:</w:t>
+          </w:r>
+          <w:bookmarkEnd w:id="24"/>
+          <w:r>
+            <w:rPr>
+              <w:lang w:eastAsia="es-MX"/>
+            </w:rPr>
+            <w:t xml:space="preserve"> </w:t>
+          </w:r>
+        </w:p>
+        <w:p>
+          <w:pPr>
+            <w:jc w:val="both"/>
+            <w:rPr>
+              <w:rFonts w:ascii="Arial" w:hAnsi="Arial" w:cs="Arial"/>
+              <w:sz w:val="24"/>
+              <w:szCs w:val="24"/>
+              <w:lang w:eastAsia="es-MX"/>
+            </w:rPr>
+          </w:pPr>
+          <w:r>
+            <w:rPr>
+              <w:rFonts w:ascii="Arial" w:hAnsi="Arial" w:cs="Arial"/>
+              <w:sz w:val="24"/>
+              <w:szCs w:val="24"/>
+              <w:lang w:eastAsia="es-MX"/>
+            </w:rPr>
+            <w:t>Como se indica en los requerimientos del ejercicio p</w:t>
+          </w:r>
+          <w:r>
+            <w:rPr>
+              <w:rFonts w:ascii="Arial" w:hAnsi="Arial" w:cs="Arial"/>
+              <w:sz w:val="24"/>
+              <w:szCs w:val="24"/>
+              <w:lang w:eastAsia="es-MX"/>
+            </w:rPr>
+            <w:t>ara garantizar la persistencia de la información y el historial de eventos, se implementó una base de datos relacional </w:t>
+          </w:r>
+          <w:r>
+            <w:rPr>
+              <w:rFonts w:ascii="Arial" w:hAnsi="Arial" w:cs="Arial"/>
+              <w:sz w:val="24"/>
+              <w:szCs w:val="24"/>
+              <w:lang w:eastAsia="es-MX"/>
+            </w:rPr>
+            <w:t>SQLite </w:t>
+          </w:r>
+          <w:r>
+            <w:rPr>
+              <w:rFonts w:ascii="Arial" w:hAnsi="Arial" w:cs="Arial"/>
+              <w:sz w:val="24"/>
+              <w:szCs w:val="24"/>
+              <w:lang w:eastAsia="es-MX"/>
+            </w:rPr>
+            <w:t>(almacenada localmente en el archivo </w:t>
+          </w:r>
+          <w:proofErr w:type="spellStart"/>
+          <w:r>
+            <w:rPr>
+              <w:rFonts w:ascii="Arial" w:hAnsi="Arial" w:cs="Arial"/>
+              <w:sz w:val="24"/>
+              <w:szCs w:val="24"/>
+              <w:lang w:eastAsia="es-MX"/>
+            </w:rPr>
+            <w:t>requests.db</w:t>
+          </w:r>
+          <w:proofErr w:type="spellEnd"/>
+          <w:r>
+            <w:rPr>
+              <w:rFonts w:ascii="Arial" w:hAnsi="Arial" w:cs="Arial"/>
+              <w:sz w:val="24"/>
+              <w:szCs w:val="24"/>
+              <w:lang w:eastAsia="es-MX"/>
+            </w:rPr>
+            <w:t>).</w:t>
+          </w:r>
+          <w:r>
+            <w:rPr>
+              <w:rFonts w:ascii="Arial" w:hAnsi="Arial" w:cs="Arial"/>
+              <w:sz w:val="24"/>
+              <w:szCs w:val="24"/>
+              <w:lang w:eastAsia="es-MX"/>
+            </w:rPr>
+            <w:t xml:space="preserve"> Con el fin de mejorar el diseño y hacerlo más escalable el</w:t>
+          </w:r>
+          <w:r>
+            <w:rPr>
+              <w:rFonts w:ascii="Arial" w:hAnsi="Arial" w:cs="Arial"/>
+              <w:sz w:val="24"/>
+              <w:szCs w:val="24"/>
+              <w:lang w:eastAsia="es-MX"/>
+            </w:rPr>
+            <w:t xml:space="preserve"> código utiliza un ORM (</w:t>
+          </w:r>
+          <w:proofErr w:type="spellStart"/>
+          <w:r>
+            <w:rPr>
+              <w:rFonts w:ascii="Arial" w:hAnsi="Arial" w:cs="Arial"/>
+              <w:sz w:val="24"/>
+              <w:szCs w:val="24"/>
+              <w:lang w:eastAsia="es-MX"/>
+            </w:rPr>
+            <w:t>Object-Relational</w:t>
+          </w:r>
+          <w:proofErr w:type="spellEnd"/>
+          <w:r>
+            <w:rPr>
+              <w:rFonts w:ascii="Arial" w:hAnsi="Arial" w:cs="Arial"/>
+              <w:sz w:val="24"/>
+              <w:szCs w:val="24"/>
+              <w:lang w:eastAsia="es-MX"/>
+            </w:rPr>
+            <w:t xml:space="preserve"> </w:t>
+          </w:r>
+          <w:proofErr w:type="spellStart"/>
+          <w:r>
+            <w:rPr>
+              <w:rFonts w:ascii="Arial" w:hAnsi="Arial" w:cs="Arial"/>
+              <w:sz w:val="24"/>
+              <w:szCs w:val="24"/>
+              <w:lang w:eastAsia="es-MX"/>
+            </w:rPr>
+            <w:t>Mapping</w:t>
+          </w:r>
+          <w:proofErr w:type="spellEnd"/>
+          <w:r>
+            <w:rPr>
+              <w:rFonts w:ascii="Arial" w:hAnsi="Arial" w:cs="Arial"/>
+              <w:sz w:val="24"/>
+              <w:szCs w:val="24"/>
+              <w:lang w:eastAsia="es-MX"/>
+            </w:rPr>
+            <w:t xml:space="preserve">) con </w:t>
+          </w:r>
+          <w:proofErr w:type="spellStart"/>
+          <w:r>
+            <w:rPr>
+              <w:rFonts w:ascii="Arial" w:hAnsi="Arial" w:cs="Arial"/>
+              <w:sz w:val="24"/>
+              <w:szCs w:val="24"/>
+              <w:lang w:eastAsia="es-MX"/>
+            </w:rPr>
+            <w:t>SQLAlchemy</w:t>
+          </w:r>
+          <w:proofErr w:type="spellEnd"/>
+          <w:r>
+            <w:rPr>
+              <w:rFonts w:ascii="Arial" w:hAnsi="Arial" w:cs="Arial"/>
+              <w:sz w:val="24"/>
+              <w:szCs w:val="24"/>
+              <w:lang w:eastAsia="es-MX"/>
+            </w:rPr>
+            <w:t xml:space="preserve"> para definir la estructura a través del archivo models.py</w:t>
+          </w:r>
+          <w:r>
+            <w:rPr>
+              <w:rFonts w:ascii="Arial" w:hAnsi="Arial" w:cs="Arial"/>
+              <w:sz w:val="24"/>
+              <w:szCs w:val="24"/>
+              <w:lang w:eastAsia="es-MX"/>
+            </w:rPr>
+            <w:t xml:space="preserve">, de igual manera se manejan migraciones para realizar cambios a la base de datos con </w:t>
+          </w:r>
+          <w:proofErr w:type="spellStart"/>
+          <w:r>
+            <w:rPr>
+              <w:rFonts w:ascii="Arial" w:hAnsi="Arial" w:cs="Arial"/>
+              <w:sz w:val="24"/>
+              <w:szCs w:val="24"/>
+              <w:lang w:eastAsia="es-MX"/>
+            </w:rPr>
+            <w:t>alembic</w:t>
+          </w:r>
+          <w:proofErr w:type="spellEnd"/>
+          <w:r>
+            <w:rPr>
+              <w:rFonts w:ascii="Arial" w:hAnsi="Arial" w:cs="Arial"/>
+              <w:sz w:val="24"/>
+              <w:szCs w:val="24"/>
+              <w:lang w:eastAsia="es-MX"/>
+            </w:rPr>
+            <w:t>. Cada transacción crítica de la simulación, como la creación de una nueva entrada (</w:t>
+          </w:r>
+          <w:proofErr w:type="spellStart"/>
+          <w:r>
+            <w:rPr>
+              <w:rFonts w:ascii="Arial" w:hAnsi="Arial" w:cs="Arial"/>
+              <w:sz w:val="24"/>
+              <w:szCs w:val="24"/>
+              <w:lang w:eastAsia="es-MX"/>
+            </w:rPr>
+            <w:t>crear_entrada</w:t>
+          </w:r>
+          <w:proofErr w:type="spellEnd"/>
+          <w:r>
+            <w:rPr>
+              <w:rFonts w:ascii="Arial" w:hAnsi="Arial" w:cs="Arial"/>
+              <w:sz w:val="24"/>
+              <w:szCs w:val="24"/>
+              <w:lang w:eastAsia="es-MX"/>
+            </w:rPr>
+            <w:t>), una nueva compra (</w:t>
+          </w:r>
+          <w:proofErr w:type="spellStart"/>
+          <w:r>
+            <w:rPr>
+              <w:rFonts w:ascii="Arial" w:hAnsi="Arial" w:cs="Arial"/>
+              <w:sz w:val="24"/>
+              <w:szCs w:val="24"/>
+              <w:lang w:eastAsia="es-MX"/>
+            </w:rPr>
+            <w:t>crear_entrega</w:t>
+          </w:r>
+          <w:proofErr w:type="spellEnd"/>
+          <w:r>
+            <w:rPr>
+              <w:rFonts w:ascii="Arial" w:hAnsi="Arial" w:cs="Arial"/>
+              <w:sz w:val="24"/>
+              <w:szCs w:val="24"/>
+              <w:lang w:eastAsia="es-MX"/>
+            </w:rPr>
+            <w:t xml:space="preserve">), o la actualización de un pedido completado, queda registrada permanentemente en la base de datos. </w:t>
+          </w:r>
+          <w:r>
+            <w:rPr>
+              <w:rFonts w:ascii="Arial" w:hAnsi="Arial" w:cs="Arial"/>
+              <w:sz w:val="24"/>
+              <w:szCs w:val="24"/>
+              <w:lang w:eastAsia="es-MX"/>
+            </w:rPr>
+            <w:t>A continuación se listan los modelos creados de las entidades que interactúan con el sistema:</w:t>
+          </w:r>
+        </w:p>
+        <w:p>
+          <w:pPr>
+            <w:pStyle w:val="Ttulo2"/>
+            <w:rPr>
+              <w:lang w:eastAsia="es-MX"/>
+            </w:rPr>
+          </w:pPr>
+          <w:bookmarkStart w:id="25" w:name="_Toc227875849"/>
+          <w:r>
+            <w:rPr>
+              <w:lang w:eastAsia="es-MX"/>
+            </w:rPr>
             <w:t>Modelo de datos</w:t>
           </w:r>
-          <w:bookmarkEnd w:id="17"/>
+          <w:bookmarkEnd w:id="25"/>
         </w:p>
         <w:p>
           <w:pPr>
@@ -3113,6 +5202,7 @@
               <w:szCs w:val="24"/>
               <w:lang w:eastAsia="es-MX"/>
             </w:rPr>
+            <w:lastRenderedPageBreak/>
             <w:t>Repartidor</w:t>
           </w:r>
           <w:r>
@@ -3197,20 +5287,31 @@
         </w:p>
         <w:p>
           <w:pPr>
+            <w:rPr>
+              <w:rFonts w:ascii="Arial" w:hAnsi="Arial" w:cs="Arial"/>
+              <w:b/>
+              <w:bCs/>
+              <w:sz w:val="24"/>
+              <w:szCs w:val="24"/>
+              <w:lang w:eastAsia="es-MX"/>
+            </w:rPr>
+          </w:pPr>
+        </w:p>
+        <w:p>
+          <w:pPr>
             <w:pStyle w:val="Ttulo1"/>
             <w:rPr>
               <w:lang w:eastAsia="es-MX"/>
             </w:rPr>
           </w:pPr>
-          <w:bookmarkStart w:id="18" w:name="_Toc227861306"/>
-          <w:r>
-            <w:lastRenderedPageBreak/>
+          <w:bookmarkStart w:id="26" w:name="_Toc227875850"/>
+          <w:r>
             <w:t>Ejecución:</w:t>
           </w:r>
         </w:p>
       </w:sdtContent>
     </w:sdt>
-    <w:bookmarkEnd w:id="18" w:displacedByCustomXml="prev"/>
+    <w:bookmarkEnd w:id="26" w:displacedByCustomXml="prev"/>
     <w:p>
       <w:pPr>
         <w:pStyle w:val="NormalWeb"/>
@@ -3264,6 +5365,7 @@
         <w:rPr>
           <w:noProof/>
         </w:rPr>
+        <w:lastRenderedPageBreak/>
         <w:drawing>
           <wp:inline distT="0" distB="0" distL="0" distR="0" wp14:anchorId="0E153442" wp14:editId="423BDC43">
             <wp:extent cx="6911979" cy="3875964"/>
@@ -3309,7 +5411,6 @@
         <w:rPr>
           <w:noProof/>
         </w:rPr>
-        <w:lastRenderedPageBreak/>
         <w:drawing>
           <wp:inline distT="0" distB="0" distL="0" distR="0" wp14:anchorId="2132E29B" wp14:editId="4CD0BFE3">
             <wp:extent cx="6916779" cy="3889612"/>
@@ -3355,6 +5456,7 @@
         <w:rPr>
           <w:noProof/>
         </w:rPr>
+        <w:lastRenderedPageBreak/>
         <w:drawing>
           <wp:inline distT="0" distB="0" distL="0" distR="0" wp14:anchorId="20D32989" wp14:editId="5639F1ED">
             <wp:extent cx="6902890" cy="3889612"/>
@@ -3400,7 +5502,6 @@
         <w:rPr>
           <w:noProof/>
         </w:rPr>
-        <w:lastRenderedPageBreak/>
         <w:drawing>
           <wp:inline distT="0" distB="0" distL="0" distR="0" wp14:anchorId="5C3A42B3" wp14:editId="13B39468">
             <wp:extent cx="6782937" cy="3842743"/>
@@ -3446,6 +5547,7 @@
         <w:rPr>
           <w:noProof/>
         </w:rPr>
+        <w:lastRenderedPageBreak/>
         <w:drawing>
           <wp:inline distT="0" distB="0" distL="0" distR="0" wp14:anchorId="1D525A73" wp14:editId="49D42F48">
             <wp:extent cx="6773625" cy="3821373"/>
@@ -3491,7 +5593,6 @@
         <w:rPr>
           <w:noProof/>
         </w:rPr>
-        <w:lastRenderedPageBreak/>
         <w:drawing>
           <wp:inline distT="0" distB="0" distL="0" distR="0" wp14:anchorId="0CC495BE" wp14:editId="523BA137">
             <wp:extent cx="6870391" cy="3875964"/>
@@ -3537,6 +5638,7 @@
         <w:rPr>
           <w:noProof/>
         </w:rPr>
+        <w:lastRenderedPageBreak/>
         <w:drawing>
           <wp:inline distT="0" distB="0" distL="0" distR="0" wp14:anchorId="6AEFDD7B" wp14:editId="57FD7C43">
             <wp:extent cx="6861338" cy="3862317"/>
@@ -3582,7 +5684,6 @@
         <w:rPr>
           <w:noProof/>
         </w:rPr>
-        <w:lastRenderedPageBreak/>
         <w:drawing>
           <wp:inline distT="0" distB="0" distL="0" distR="0" wp14:anchorId="77E45D6C" wp14:editId="6CBA729F">
             <wp:extent cx="6866443" cy="3903260"/>
@@ -3628,6 +5729,7 @@
         <w:rPr>
           <w:noProof/>
         </w:rPr>
+        <w:lastRenderedPageBreak/>
         <w:drawing>
           <wp:inline distT="0" distB="0" distL="0" distR="0" wp14:anchorId="392D208A" wp14:editId="4C90EE13">
             <wp:extent cx="6845348" cy="3848669"/>
@@ -3673,7 +5775,6 @@
         <w:rPr>
           <w:noProof/>
         </w:rPr>
-        <w:lastRenderedPageBreak/>
         <w:drawing>
           <wp:inline distT="0" distB="0" distL="0" distR="0" wp14:anchorId="615CB44E" wp14:editId="1C99FA88">
             <wp:extent cx="6695601" cy="3725839"/>
@@ -3719,11 +5820,12 @@
         <w:rPr>
           <w:noProof/>
         </w:rPr>
+        <w:lastRenderedPageBreak/>
         <w:drawing>
-          <wp:inline distT="0" distB="0" distL="0" distR="0" wp14:anchorId="35C7EE9A" wp14:editId="7773F205">
-            <wp:extent cx="6749608" cy="3794077"/>
+          <wp:inline distT="0" distB="0" distL="0" distR="0" wp14:anchorId="42C3BFFF" wp14:editId="31587944">
+            <wp:extent cx="6620510" cy="3722925"/>
             <wp:effectExtent l="0" t="0" r="0" b="0"/>
-            <wp:docPr id="9" name="Imagen 9"/>
+            <wp:docPr id="15" name="Imagen 15"/>
             <wp:cNvGraphicFramePr>
               <a:graphicFrameLocks xmlns:a="http://schemas.openxmlformats.org/drawingml/2006/main" noChangeAspect="1"/>
             </wp:cNvGraphicFramePr>
@@ -3743,7 +5845,7 @@
                   <pic:spPr>
                     <a:xfrm>
                       <a:off x="0" y="0"/>
-                      <a:ext cx="6759629" cy="3799710"/>
+                      <a:ext cx="6620510" cy="3722925"/>
                     </a:xfrm>
                     <a:prstGeom prst="rect">
                       <a:avLst/>
@@ -3755,21 +5857,15 @@
           </wp:inline>
         </w:drawing>
       </w:r>
-    </w:p>
-    <w:p>
-      <w:pPr>
-        <w:pStyle w:val="NormalWeb"/>
-      </w:pPr>
       <w:r>
         <w:rPr>
           <w:noProof/>
         </w:rPr>
-        <w:lastRenderedPageBreak/>
         <w:drawing>
-          <wp:inline distT="0" distB="0" distL="0" distR="0" wp14:anchorId="50B34B68" wp14:editId="5B3202FF">
-            <wp:extent cx="6851176" cy="3852721"/>
-            <wp:effectExtent l="0" t="0" r="6985" b="0"/>
-            <wp:docPr id="15" name="Imagen 15"/>
+          <wp:inline distT="0" distB="0" distL="0" distR="0" wp14:anchorId="35C7EE9A" wp14:editId="7773F205">
+            <wp:extent cx="6749608" cy="3794077"/>
+            <wp:effectExtent l="0" t="0" r="0" b="0"/>
+            <wp:docPr id="9" name="Imagen 9"/>
             <wp:cNvGraphicFramePr>
               <a:graphicFrameLocks xmlns:a="http://schemas.openxmlformats.org/drawingml/2006/main" noChangeAspect="1"/>
             </wp:cNvGraphicFramePr>
@@ -3789,7 +5885,7 @@
                   <pic:spPr>
                     <a:xfrm>
                       <a:off x="0" y="0"/>
-                      <a:ext cx="6859993" cy="3857679"/>
+                      <a:ext cx="6759629" cy="3799710"/>
                     </a:xfrm>
                     <a:prstGeom prst="rect">
                       <a:avLst/>
@@ -3801,7 +5897,13 @@
           </wp:inline>
         </w:drawing>
       </w:r>
-      <w:r>
+    </w:p>
+    <w:p>
+      <w:pPr>
+        <w:pStyle w:val="NormalWeb"/>
+      </w:pPr>
+      <w:r>
+        <w:lastRenderedPageBreak/>
         <w:br/>
       </w:r>
       <w:r>
@@ -3853,7 +5955,6 @@
         <w:rPr>
           <w:noProof/>
         </w:rPr>
-        <w:lastRenderedPageBreak/>
         <w:drawing>
           <wp:inline distT="0" distB="0" distL="0" distR="0" wp14:anchorId="3578FDA8" wp14:editId="4E981675">
             <wp:extent cx="6858000" cy="3826510"/>
@@ -3895,16 +5996,17 @@
       <w:pPr>
         <w:pStyle w:val="Ttulo1"/>
       </w:pPr>
-      <w:bookmarkStart w:id="19" w:name="_Toc227861307"/>
-      <w:proofErr w:type="spellStart"/>
-      <w:r>
+      <w:bookmarkStart w:id="27" w:name="_Toc227875851"/>
+      <w:proofErr w:type="spellStart"/>
+      <w:r>
+        <w:lastRenderedPageBreak/>
         <w:t>Prompts</w:t>
       </w:r>
       <w:proofErr w:type="spellEnd"/>
       <w:r>
         <w:t>:</w:t>
       </w:r>
-      <w:bookmarkEnd w:id="19"/>
+      <w:bookmarkEnd w:id="27"/>
     </w:p>
     <w:p>
       <w:pPr>
@@ -4033,7 +6135,7 @@
       <w:pPr>
         <w:pStyle w:val="Ttulo2"/>
       </w:pPr>
-      <w:bookmarkStart w:id="20" w:name="_Toc227861308"/>
+      <w:bookmarkStart w:id="28" w:name="_Toc227875852"/>
       <w:proofErr w:type="spellStart"/>
       <w:r>
         <w:t>Prompt</w:t>
@@ -4042,7 +6144,7 @@
       <w:r>
         <w:t xml:space="preserve"> 1</w:t>
       </w:r>
-      <w:bookmarkEnd w:id="20"/>
+      <w:bookmarkEnd w:id="28"/>
     </w:p>
     <w:p>
       <w:pPr>
@@ -4171,17 +6273,16 @@
       <w:pPr>
         <w:pStyle w:val="Ttulo2"/>
       </w:pPr>
-      <w:bookmarkStart w:id="21" w:name="_Toc227861309"/>
-      <w:proofErr w:type="spellStart"/>
-      <w:r>
-        <w:lastRenderedPageBreak/>
+      <w:bookmarkStart w:id="29" w:name="_Toc227875853"/>
+      <w:proofErr w:type="spellStart"/>
+      <w:r>
         <w:t>Prompt</w:t>
       </w:r>
       <w:proofErr w:type="spellEnd"/>
       <w:r>
         <w:t xml:space="preserve"> 2</w:t>
       </w:r>
-      <w:bookmarkEnd w:id="21"/>
+      <w:bookmarkEnd w:id="29"/>
     </w:p>
     <w:p>
       <w:pPr>
@@ -4244,7 +6345,7 @@
       <w:pPr>
         <w:pStyle w:val="Ttulo2"/>
       </w:pPr>
-      <w:bookmarkStart w:id="22" w:name="_Toc227861310"/>
+      <w:bookmarkStart w:id="30" w:name="_Toc227875854"/>
       <w:proofErr w:type="spellStart"/>
       <w:r>
         <w:t>Prompt</w:t>
@@ -4253,7 +6354,7 @@
       <w:r>
         <w:t xml:space="preserve"> 3</w:t>
       </w:r>
-      <w:bookmarkEnd w:id="22"/>
+      <w:bookmarkEnd w:id="30"/>
     </w:p>
     <w:p>
       <w:pPr>
@@ -4357,7 +6458,7 @@
       <w:pPr>
         <w:pStyle w:val="Ttulo2"/>
       </w:pPr>
-      <w:bookmarkStart w:id="23" w:name="_Toc227861311"/>
+      <w:bookmarkStart w:id="31" w:name="_Toc227875855"/>
       <w:proofErr w:type="spellStart"/>
       <w:r>
         <w:t>Prompt</w:t>
@@ -4369,7 +6470,7 @@
       <w:r>
         <w:t>4</w:t>
       </w:r>
-      <w:bookmarkEnd w:id="23"/>
+      <w:bookmarkEnd w:id="31"/>
     </w:p>
     <w:p>
       <w:pPr>
@@ -4432,7 +6533,7 @@
       <w:pPr>
         <w:pStyle w:val="Ttulo2"/>
       </w:pPr>
-      <w:bookmarkStart w:id="24" w:name="_Toc227861312"/>
+      <w:bookmarkStart w:id="32" w:name="_Toc227875856"/>
       <w:proofErr w:type="spellStart"/>
       <w:r>
         <w:t>Prompt</w:t>
@@ -4444,7 +6545,7 @@
       <w:r>
         <w:t>5</w:t>
       </w:r>
-      <w:bookmarkEnd w:id="24"/>
+      <w:bookmarkEnd w:id="32"/>
     </w:p>
     <w:p>
       <w:pPr>
@@ -4578,9 +6679,10 @@
       <w:pPr>
         <w:pStyle w:val="Ttulo2"/>
       </w:pPr>
-      <w:bookmarkStart w:id="25" w:name="_Toc227861313"/>
-      <w:proofErr w:type="spellStart"/>
-      <w:r>
+      <w:bookmarkStart w:id="33" w:name="_Toc227875857"/>
+      <w:proofErr w:type="spellStart"/>
+      <w:r>
+        <w:lastRenderedPageBreak/>
         <w:t>P</w:t>
       </w:r>
       <w:r>
@@ -4590,7 +6692,7 @@
       <w:r>
         <w:t xml:space="preserve"> 6</w:t>
       </w:r>
-      <w:bookmarkEnd w:id="25"/>
+      <w:bookmarkEnd w:id="33"/>
     </w:p>
     <w:p>
       <w:pPr>
@@ -4799,7 +6901,7 @@
       <w:pPr>
         <w:pStyle w:val="Ttulo2"/>
       </w:pPr>
-      <w:bookmarkStart w:id="26" w:name="_Toc227861314"/>
+      <w:bookmarkStart w:id="34" w:name="_Toc227875858"/>
       <w:proofErr w:type="spellStart"/>
       <w:r>
         <w:t>Prompt</w:t>
@@ -4811,7 +6913,7 @@
       <w:r>
         <w:t>7</w:t>
       </w:r>
-      <w:bookmarkEnd w:id="26"/>
+      <w:bookmarkEnd w:id="34"/>
     </w:p>
     <w:p>
       <w:pPr>
@@ -4846,10 +6948,9 @@
       <w:pPr>
         <w:pStyle w:val="Ttulo2"/>
       </w:pPr>
-      <w:bookmarkStart w:id="27" w:name="_Toc227861315"/>
-      <w:proofErr w:type="spellStart"/>
-      <w:r>
-        <w:lastRenderedPageBreak/>
+      <w:bookmarkStart w:id="35" w:name="_Toc227875859"/>
+      <w:proofErr w:type="spellStart"/>
+      <w:r>
         <w:t>Prompt</w:t>
       </w:r>
       <w:proofErr w:type="spellEnd"/>
@@ -4859,7 +6960,7 @@
       <w:r>
         <w:t>8</w:t>
       </w:r>
-      <w:bookmarkEnd w:id="27"/>
+      <w:bookmarkEnd w:id="35"/>
     </w:p>
     <w:p>
       <w:pPr>
@@ -4884,7 +6985,7 @@
           <w:lang w:eastAsia="es-MX"/>
         </w:rPr>
       </w:pPr>
-      <w:bookmarkStart w:id="28" w:name="_Toc227861316"/>
+      <w:bookmarkStart w:id="36" w:name="_Toc227875860"/>
       <w:proofErr w:type="spellStart"/>
       <w:r>
         <w:rPr>
@@ -4908,7 +7009,7 @@
         </w:rPr>
         <w:t>9</w:t>
       </w:r>
-      <w:bookmarkEnd w:id="28"/>
+      <w:bookmarkEnd w:id="36"/>
     </w:p>
     <w:p>
       <w:pPr>
@@ -5043,7 +7144,7 @@
       <w:pPr>
         <w:pStyle w:val="Ttulo2"/>
       </w:pPr>
-      <w:bookmarkStart w:id="29" w:name="_Toc227861317"/>
+      <w:bookmarkStart w:id="37" w:name="_Toc227875861"/>
       <w:proofErr w:type="spellStart"/>
       <w:r>
         <w:t>Prompt</w:t>
@@ -5055,7 +7156,7 @@
       <w:r>
         <w:t>10</w:t>
       </w:r>
-      <w:bookmarkEnd w:id="29"/>
+      <w:bookmarkEnd w:id="37"/>
     </w:p>
     <w:p>
       <w:pPr>
@@ -5071,14 +7172,12 @@
         </w:rPr>
         <w:t xml:space="preserve">Me ayudas </w:t>
       </w:r>
-      <w:proofErr w:type="spellStart"/>
-      <w:r>
-        <w:rPr>
-          <w:rFonts w:ascii="Arial" w:hAnsi="Arial" w:cs="Arial"/>
-        </w:rPr>
-        <w:t>aq</w:t>
-      </w:r>
-      <w:proofErr w:type="spellEnd"/>
+      <w:r>
+        <w:rPr>
+          <w:rFonts w:ascii="Arial" w:hAnsi="Arial" w:cs="Arial"/>
+        </w:rPr>
+        <w:t>a</w:t>
+      </w:r>
       <w:r>
         <w:rPr>
           <w:rFonts w:ascii="Arial" w:hAnsi="Arial" w:cs="Arial"/>
@@ -5105,28 +7204,24 @@
         </w:rPr>
         <w:t xml:space="preserve"> que contiene el </w:t>
       </w:r>
-      <w:proofErr w:type="spellStart"/>
-      <w:r>
-        <w:rPr>
-          <w:rFonts w:ascii="Arial" w:hAnsi="Arial" w:cs="Arial"/>
-        </w:rPr>
-        <w:t>nuemro</w:t>
-      </w:r>
-      <w:proofErr w:type="spellEnd"/>
+      <w:r>
+        <w:rPr>
+          <w:rFonts w:ascii="Arial" w:hAnsi="Arial" w:cs="Arial"/>
+        </w:rPr>
+        <w:t>número</w:t>
+      </w:r>
       <w:r>
         <w:rPr>
           <w:rFonts w:ascii="Arial" w:hAnsi="Arial" w:cs="Arial"/>
         </w:rPr>
         <w:t xml:space="preserve"> de </w:t>
       </w:r>
-      <w:proofErr w:type="spellStart"/>
-      <w:r>
-        <w:rPr>
-          <w:rFonts w:ascii="Arial" w:hAnsi="Arial" w:cs="Arial"/>
-        </w:rPr>
-        <w:t>pagina</w:t>
-      </w:r>
-      <w:proofErr w:type="spellEnd"/>
+      <w:r>
+        <w:rPr>
+          <w:rFonts w:ascii="Arial" w:hAnsi="Arial" w:cs="Arial"/>
+        </w:rPr>
+        <w:t>página</w:t>
+      </w:r>
       <w:r>
         <w:rPr>
           <w:rFonts w:ascii="Arial" w:hAnsi="Arial" w:cs="Arial"/>
@@ -5172,6 +7267,7 @@
           <w:rFonts w:ascii="Arial" w:hAnsi="Arial" w:cs="Arial"/>
           <w:lang w:val="en-US"/>
         </w:rPr>
+        <w:lastRenderedPageBreak/>
         <w:t>dispatch_event</w:t>
       </w:r>
       <w:proofErr w:type="spellEnd"/>
@@ -5379,7 +7475,7 @@
       <w:pPr>
         <w:pStyle w:val="Ttulo2"/>
       </w:pPr>
-      <w:bookmarkStart w:id="30" w:name="_Toc227861318"/>
+      <w:bookmarkStart w:id="38" w:name="_Toc227875862"/>
       <w:proofErr w:type="spellStart"/>
       <w:r>
         <w:t>Prompt</w:t>
@@ -5391,7 +7487,7 @@
       <w:r>
         <w:t>1</w:t>
       </w:r>
-      <w:bookmarkEnd w:id="30"/>
+      <w:bookmarkEnd w:id="38"/>
     </w:p>
     <w:p>
       <w:pPr>
@@ -5426,7 +7522,7 @@
       <w:pPr>
         <w:pStyle w:val="Ttulo2"/>
       </w:pPr>
-      <w:bookmarkStart w:id="31" w:name="_Toc227861319"/>
+      <w:bookmarkStart w:id="39" w:name="_Toc227875863"/>
       <w:proofErr w:type="spellStart"/>
       <w:r>
         <w:t>Prompt</w:t>
@@ -5438,7 +7534,7 @@
       <w:r>
         <w:t>2</w:t>
       </w:r>
-      <w:bookmarkEnd w:id="31"/>
+      <w:bookmarkEnd w:id="39"/>
     </w:p>
     <w:p>
       <w:pPr>
@@ -5494,14 +7590,7 @@
         <w:rPr>
           <w:rFonts w:ascii="Arial" w:hAnsi="Arial" w:cs="Arial"/>
         </w:rPr>
-        <w:t xml:space="preserve"> en versiones como la 0.28.1, pero por lo que he estado revisando el manejo de estas ha cambiado, podrías proporcionarme un ejemplo </w:t>
-      </w:r>
-      <w:r>
-        <w:rPr>
-          <w:rFonts w:ascii="Arial" w:hAnsi="Arial" w:cs="Arial"/>
-        </w:rPr>
-        <w:lastRenderedPageBreak/>
-        <w:t xml:space="preserve">funcional </w:t>
+        <w:t xml:space="preserve"> en versiones como la 0.28.1, pero por lo que he estado revisando el manejo de estas ha cambiado, podrías proporcionarme un ejemplo funcional </w:t>
       </w:r>
       <w:proofErr w:type="spellStart"/>
       <w:r>
@@ -5565,7 +7654,7 @@
       <w:pPr>
         <w:pStyle w:val="Ttulo2"/>
       </w:pPr>
-      <w:bookmarkStart w:id="32" w:name="_Toc227861320"/>
+      <w:bookmarkStart w:id="40" w:name="_Toc227875864"/>
       <w:proofErr w:type="spellStart"/>
       <w:r>
         <w:t>Prompt</w:t>
@@ -5577,7 +7666,7 @@
       <w:r>
         <w:t>3</w:t>
       </w:r>
-      <w:bookmarkEnd w:id="32"/>
+      <w:bookmarkEnd w:id="40"/>
     </w:p>
     <w:p>
       <w:pPr>
@@ -5626,7 +7715,7 @@
       <w:pPr>
         <w:pStyle w:val="Ttulo2"/>
       </w:pPr>
-      <w:bookmarkStart w:id="33" w:name="_Toc227861321"/>
+      <w:bookmarkStart w:id="41" w:name="_Toc227875865"/>
       <w:proofErr w:type="spellStart"/>
       <w:r>
         <w:t>Prompt</w:t>
@@ -5638,7 +7727,7 @@
       <w:r>
         <w:t>4</w:t>
       </w:r>
-      <w:bookmarkEnd w:id="33"/>
+      <w:bookmarkEnd w:id="41"/>
     </w:p>
     <w:p>
       <w:pPr>
@@ -5963,9 +8052,10 @@
       <w:pPr>
         <w:pStyle w:val="Ttulo2"/>
       </w:pPr>
-      <w:bookmarkStart w:id="34" w:name="_Toc227861322"/>
-      <w:proofErr w:type="spellStart"/>
-      <w:r>
+      <w:bookmarkStart w:id="42" w:name="_Toc227875866"/>
+      <w:proofErr w:type="spellStart"/>
+      <w:r>
+        <w:lastRenderedPageBreak/>
         <w:t>Prompt</w:t>
       </w:r>
       <w:proofErr w:type="spellEnd"/>
@@ -5978,7 +8068,7 @@
       <w:r>
         <w:t>5</w:t>
       </w:r>
-      <w:bookmarkEnd w:id="34"/>
+      <w:bookmarkEnd w:id="42"/>
     </w:p>
     <w:p>
       <w:pPr>
@@ -6071,7 +8161,7 @@
       <w:pPr>
         <w:pStyle w:val="Ttulo2"/>
       </w:pPr>
-      <w:bookmarkStart w:id="35" w:name="_Toc227861323"/>
+      <w:bookmarkStart w:id="43" w:name="_Toc227875867"/>
       <w:proofErr w:type="spellStart"/>
       <w:r>
         <w:t>Prompt</w:t>
@@ -6083,7 +8173,7 @@
       <w:r>
         <w:t>6</w:t>
       </w:r>
-      <w:bookmarkEnd w:id="35"/>
+      <w:bookmarkEnd w:id="43"/>
     </w:p>
     <w:p>
       <w:pPr>
@@ -6146,7 +8236,7 @@
       <w:pPr>
         <w:pStyle w:val="Ttulo2"/>
       </w:pPr>
-      <w:bookmarkStart w:id="36" w:name="_Toc227861324"/>
+      <w:bookmarkStart w:id="44" w:name="_Toc227875868"/>
       <w:proofErr w:type="spellStart"/>
       <w:r>
         <w:t>Prompt</w:t>
@@ -6158,7 +8248,7 @@
       <w:r>
         <w:t>7</w:t>
       </w:r>
-      <w:bookmarkEnd w:id="36"/>
+      <w:bookmarkEnd w:id="44"/>
     </w:p>
     <w:p>
       <w:pPr>
@@ -6193,7 +8283,7 @@
       <w:pPr>
         <w:pStyle w:val="Ttulo2"/>
       </w:pPr>
-      <w:bookmarkStart w:id="37" w:name="_Toc227861325"/>
+      <w:bookmarkStart w:id="45" w:name="_Toc227875869"/>
       <w:proofErr w:type="spellStart"/>
       <w:r>
         <w:t>Prompt</w:t>
@@ -6205,7 +8295,7 @@
       <w:r>
         <w:t>8</w:t>
       </w:r>
-      <w:bookmarkEnd w:id="37"/>
+      <w:bookmarkEnd w:id="45"/>
     </w:p>
     <w:p>
       <w:pPr>
@@ -6233,14 +8323,7 @@
         <w:rPr>
           <w:rFonts w:ascii="Arial" w:hAnsi="Arial" w:cs="Arial"/>
         </w:rPr>
-        <w:t xml:space="preserve"> cuenta de que al hacer esto la interfaz se detenía, por lo que decidí implementar un hilo demonio para que no intervenga con el </w:t>
-      </w:r>
-      <w:r>
-        <w:rPr>
-          <w:rFonts w:ascii="Arial" w:hAnsi="Arial" w:cs="Arial"/>
-        </w:rPr>
-        <w:lastRenderedPageBreak/>
-        <w:t xml:space="preserve">flujo de la interfaz, pero la vista donde se muestran los logs no se </w:t>
+        <w:t xml:space="preserve"> cuenta de que al hacer esto la interfaz se detenía, por lo que decidí implementar un hilo demonio para que no intervenga con el flujo de la interfaz, pero la vista donde se muestran los logs no se </w:t>
       </w:r>
       <w:r>
         <w:rPr>
@@ -6259,7 +8342,7 @@
       <w:pPr>
         <w:pStyle w:val="Ttulo2"/>
       </w:pPr>
-      <w:bookmarkStart w:id="38" w:name="_Toc227861326"/>
+      <w:bookmarkStart w:id="46" w:name="_Toc227875870"/>
       <w:proofErr w:type="spellStart"/>
       <w:r>
         <w:t>Prompt</w:t>
@@ -6274,7 +8357,7 @@
       <w:r>
         <w:t>9</w:t>
       </w:r>
-      <w:bookmarkEnd w:id="38"/>
+      <w:bookmarkEnd w:id="46"/>
     </w:p>
     <w:p>
       <w:pPr>
@@ -6435,7 +8518,7 @@
       <w:pPr>
         <w:pStyle w:val="Ttulo2"/>
       </w:pPr>
-      <w:bookmarkStart w:id="39" w:name="_Toc227861327"/>
+      <w:bookmarkStart w:id="47" w:name="_Toc227875871"/>
       <w:proofErr w:type="spellStart"/>
       <w:r>
         <w:t>Prompt</w:t>
@@ -6444,7 +8527,7 @@
       <w:r>
         <w:t xml:space="preserve"> 20</w:t>
       </w:r>
-      <w:bookmarkEnd w:id="39"/>
+      <w:bookmarkEnd w:id="47"/>
     </w:p>
     <w:p>
       <w:pPr>
@@ -6501,11 +8584,11 @@
       <w:pPr>
         <w:pStyle w:val="Ttulo1"/>
       </w:pPr>
-      <w:bookmarkStart w:id="40" w:name="_Toc227861328"/>
+      <w:bookmarkStart w:id="48" w:name="_Toc227875872"/>
       <w:r>
         <w:t>Código</w:t>
       </w:r>
-      <w:bookmarkEnd w:id="40"/>
+      <w:bookmarkEnd w:id="48"/>
     </w:p>
     <w:p>
       <w:pPr>
@@ -6702,6 +8785,155 @@
 <file path=word/numbering.xml><?xml version="1.0" encoding="utf-8"?>
 <w:numbering xmlns:wpc="http://schemas.microsoft.com/office/word/2010/wordprocessingCanvas" xmlns:cx="http://schemas.microsoft.com/office/drawing/2014/chartex" xmlns:cx1="http://schemas.microsoft.com/office/drawing/2015/9/8/chartex" xmlns:cx2="http://schemas.microsoft.com/office/drawing/2015/10/21/chartex" xmlns:cx3="http://schemas.microsoft.com/office/drawing/2016/5/9/chartex" xmlns:cx4="http://schemas.microsoft.com/office/drawing/2016/5/10/chartex" xmlns:cx5="http://schemas.microsoft.com/office/drawing/2016/5/11/chartex" xmlns:cx6="http://schemas.microsoft.com/office/drawing/2016/5/12/chartex" xmlns:cx7="http://schemas.microsoft.com/office/drawing/2016/5/13/chartex" xmlns:cx8="http://schemas.microsoft.com/office/drawing/2016/5/14/chartex" xmlns:mc="http://schemas.openxmlformats.org/markup-compatibility/2006" xmlns:aink="http://schemas.microsoft.com/office/drawing/2016/ink" xmlns:am3d="http://schemas.microsoft.com/office/drawing/2017/model3d" xmlns:o="urn:schemas-microsoft-com:office:office" xmlns:oel="http://schemas.microsoft.com/office/2019/extlst" xmlns:r="http://schemas.openxmlformats.org/officeDocument/2006/relationships" xmlns:m="http://schemas.openxmlformats.org/officeDocument/2006/math" xmlns:v="urn:schemas-microsoft-com:vml" xmlns:wp14="http://schemas.microsoft.com/office/word/2010/wordprocessingDrawing" xmlns:wp="http://schemas.openxmlformats.org/drawingml/2006/wordprocessingDrawing" xmlns:w10="urn:schemas-microsoft-com:office:word" xmlns:w="http://schemas.openxmlformats.org/wordprocessingml/2006/main" xmlns:w14="http://schemas.microsoft.com/office/word/2010/wordml" xmlns:w15="http://schemas.microsoft.com/office/word/2012/wordml" xmlns:w16cex="http://schemas.microsoft.com/office/word/2018/wordml/cex" xmlns:w16cid="http://schemas.microsoft.com/office/word/2016/wordml/cid" xmlns:w16="http://schemas.microsoft.com/office/word/2018/wordml" xmlns:w16sdtdh="http://schemas.microsoft.com/office/word/2020/wordml/sdtdatahash" xmlns:w16se="http://schemas.microsoft.com/office/word/2015/wordml/symex" xmlns:wpg="http://schemas.microsoft.com/office/word/2010/wordprocessingGroup" xmlns:wpi="http://schemas.microsoft.com/office/word/2010/wordprocessingInk" xmlns:wne="http://schemas.microsoft.com/office/word/2006/wordml" xmlns:wps="http://schemas.microsoft.com/office/word/2010/wordprocessingShape" mc:Ignorable="w14 w15 w16se w16cid w16 w16cex w16sdtdh wp14">
   <w:abstractNum w:abstractNumId="0" w15:restartNumberingAfterBreak="0">
+    <w:nsid w:val="35E548B3"/>
+    <w:multiLevelType w:val="multilevel"/>
+    <w:tmpl w:val="7EECA250"/>
+    <w:lvl w:ilvl="0">
+      <w:start w:val="1"/>
+      <w:numFmt w:val="bullet"/>
+      <w:lvlText w:val=""/>
+      <w:lvlJc w:val="left"/>
+      <w:pPr>
+        <w:tabs>
+          <w:tab w:val="num" w:pos="360"/>
+        </w:tabs>
+        <w:ind w:left="360" w:hanging="360"/>
+      </w:pPr>
+      <w:rPr>
+        <w:rFonts w:ascii="Symbol" w:hAnsi="Symbol" w:hint="default"/>
+        <w:sz w:val="20"/>
+      </w:rPr>
+    </w:lvl>
+    <w:lvl w:ilvl="1" w:tentative="1">
+      <w:start w:val="1"/>
+      <w:numFmt w:val="bullet"/>
+      <w:lvlText w:val=""/>
+      <w:lvlJc w:val="left"/>
+      <w:pPr>
+        <w:tabs>
+          <w:tab w:val="num" w:pos="1080"/>
+        </w:tabs>
+        <w:ind w:left="1080" w:hanging="360"/>
+      </w:pPr>
+      <w:rPr>
+        <w:rFonts w:ascii="Symbol" w:hAnsi="Symbol" w:hint="default"/>
+        <w:sz w:val="20"/>
+      </w:rPr>
+    </w:lvl>
+    <w:lvl w:ilvl="2" w:tentative="1">
+      <w:start w:val="1"/>
+      <w:numFmt w:val="bullet"/>
+      <w:lvlText w:val=""/>
+      <w:lvlJc w:val="left"/>
+      <w:pPr>
+        <w:tabs>
+          <w:tab w:val="num" w:pos="1800"/>
+        </w:tabs>
+        <w:ind w:left="1800" w:hanging="360"/>
+      </w:pPr>
+      <w:rPr>
+        <w:rFonts w:ascii="Symbol" w:hAnsi="Symbol" w:hint="default"/>
+        <w:sz w:val="20"/>
+      </w:rPr>
+    </w:lvl>
+    <w:lvl w:ilvl="3" w:tentative="1">
+      <w:start w:val="1"/>
+      <w:numFmt w:val="bullet"/>
+      <w:lvlText w:val=""/>
+      <w:lvlJc w:val="left"/>
+      <w:pPr>
+        <w:tabs>
+          <w:tab w:val="num" w:pos="2520"/>
+        </w:tabs>
+        <w:ind w:left="2520" w:hanging="360"/>
+      </w:pPr>
+      <w:rPr>
+        <w:rFonts w:ascii="Symbol" w:hAnsi="Symbol" w:hint="default"/>
+        <w:sz w:val="20"/>
+      </w:rPr>
+    </w:lvl>
+    <w:lvl w:ilvl="4" w:tentative="1">
+      <w:start w:val="1"/>
+      <w:numFmt w:val="bullet"/>
+      <w:lvlText w:val=""/>
+      <w:lvlJc w:val="left"/>
+      <w:pPr>
+        <w:tabs>
+          <w:tab w:val="num" w:pos="3240"/>
+        </w:tabs>
+        <w:ind w:left="3240" w:hanging="360"/>
+      </w:pPr>
+      <w:rPr>
+        <w:rFonts w:ascii="Symbol" w:hAnsi="Symbol" w:hint="default"/>
+        <w:sz w:val="20"/>
+      </w:rPr>
+    </w:lvl>
+    <w:lvl w:ilvl="5" w:tentative="1">
+      <w:start w:val="1"/>
+      <w:numFmt w:val="bullet"/>
+      <w:lvlText w:val=""/>
+      <w:lvlJc w:val="left"/>
+      <w:pPr>
+        <w:tabs>
+          <w:tab w:val="num" w:pos="3960"/>
+        </w:tabs>
+        <w:ind w:left="3960" w:hanging="360"/>
+      </w:pPr>
+      <w:rPr>
+        <w:rFonts w:ascii="Symbol" w:hAnsi="Symbol" w:hint="default"/>
+        <w:sz w:val="20"/>
+      </w:rPr>
+    </w:lvl>
+    <w:lvl w:ilvl="6" w:tentative="1">
+      <w:start w:val="1"/>
+      <w:numFmt w:val="bullet"/>
+      <w:lvlText w:val=""/>
+      <w:lvlJc w:val="left"/>
+      <w:pPr>
+        <w:tabs>
+          <w:tab w:val="num" w:pos="4680"/>
+        </w:tabs>
+        <w:ind w:left="4680" w:hanging="360"/>
+      </w:pPr>
+      <w:rPr>
+        <w:rFonts w:ascii="Symbol" w:hAnsi="Symbol" w:hint="default"/>
+        <w:sz w:val="20"/>
+      </w:rPr>
+    </w:lvl>
+    <w:lvl w:ilvl="7" w:tentative="1">
+      <w:start w:val="1"/>
+      <w:numFmt w:val="bullet"/>
+      <w:lvlText w:val=""/>
+      <w:lvlJc w:val="left"/>
+      <w:pPr>
+        <w:tabs>
+          <w:tab w:val="num" w:pos="5400"/>
+        </w:tabs>
+        <w:ind w:left="5400" w:hanging="360"/>
+      </w:pPr>
+      <w:rPr>
+        <w:rFonts w:ascii="Symbol" w:hAnsi="Symbol" w:hint="default"/>
+        <w:sz w:val="20"/>
+      </w:rPr>
+    </w:lvl>
+    <w:lvl w:ilvl="8" w:tentative="1">
+      <w:start w:val="1"/>
+      <w:numFmt w:val="bullet"/>
+      <w:lvlText w:val=""/>
+      <w:lvlJc w:val="left"/>
+      <w:pPr>
+        <w:tabs>
+          <w:tab w:val="num" w:pos="6120"/>
+        </w:tabs>
+        <w:ind w:left="6120" w:hanging="360"/>
+      </w:pPr>
+      <w:rPr>
+        <w:rFonts w:ascii="Symbol" w:hAnsi="Symbol" w:hint="default"/>
+        <w:sz w:val="20"/>
+      </w:rPr>
+    </w:lvl>
+  </w:abstractNum>
+  <w:abstractNum w:abstractNumId="1" w15:restartNumberingAfterBreak="0">
     <w:nsid w:val="4AC359AA"/>
     <w:multiLevelType w:val="multilevel"/>
     <w:tmpl w:val="4D980F8C"/>
@@ -6850,7 +9082,7 @@
       </w:rPr>
     </w:lvl>
   </w:abstractNum>
-  <w:abstractNum w:abstractNumId="1" w15:restartNumberingAfterBreak="0">
+  <w:abstractNum w:abstractNumId="2" w15:restartNumberingAfterBreak="0">
     <w:nsid w:val="66257417"/>
     <w:multiLevelType w:val="multilevel"/>
     <w:tmpl w:val="C1325284"/>
@@ -6999,7 +9231,120 @@
       </w:rPr>
     </w:lvl>
   </w:abstractNum>
-  <w:abstractNum w:abstractNumId="2" w15:restartNumberingAfterBreak="0">
+  <w:abstractNum w:abstractNumId="3" w15:restartNumberingAfterBreak="0">
+    <w:nsid w:val="66B161B9"/>
+    <w:multiLevelType w:val="multilevel"/>
+    <w:tmpl w:val="75220C6C"/>
+    <w:lvl w:ilvl="0">
+      <w:start w:val="1"/>
+      <w:numFmt w:val="decimal"/>
+      <w:lvlText w:val="%1."/>
+      <w:lvlJc w:val="left"/>
+      <w:pPr>
+        <w:tabs>
+          <w:tab w:val="num" w:pos="720"/>
+        </w:tabs>
+        <w:ind w:left="720" w:hanging="360"/>
+      </w:pPr>
+    </w:lvl>
+    <w:lvl w:ilvl="1" w:tentative="1">
+      <w:start w:val="1"/>
+      <w:numFmt w:val="decimal"/>
+      <w:lvlText w:val="%2."/>
+      <w:lvlJc w:val="left"/>
+      <w:pPr>
+        <w:tabs>
+          <w:tab w:val="num" w:pos="1440"/>
+        </w:tabs>
+        <w:ind w:left="1440" w:hanging="360"/>
+      </w:pPr>
+    </w:lvl>
+    <w:lvl w:ilvl="2" w:tentative="1">
+      <w:start w:val="1"/>
+      <w:numFmt w:val="decimal"/>
+      <w:lvlText w:val="%3."/>
+      <w:lvlJc w:val="left"/>
+      <w:pPr>
+        <w:tabs>
+          <w:tab w:val="num" w:pos="2160"/>
+        </w:tabs>
+        <w:ind w:left="2160" w:hanging="360"/>
+      </w:pPr>
+    </w:lvl>
+    <w:lvl w:ilvl="3" w:tentative="1">
+      <w:start w:val="1"/>
+      <w:numFmt w:val="decimal"/>
+      <w:lvlText w:val="%4."/>
+      <w:lvlJc w:val="left"/>
+      <w:pPr>
+        <w:tabs>
+          <w:tab w:val="num" w:pos="2880"/>
+        </w:tabs>
+        <w:ind w:left="2880" w:hanging="360"/>
+      </w:pPr>
+    </w:lvl>
+    <w:lvl w:ilvl="4" w:tentative="1">
+      <w:start w:val="1"/>
+      <w:numFmt w:val="decimal"/>
+      <w:lvlText w:val="%5."/>
+      <w:lvlJc w:val="left"/>
+      <w:pPr>
+        <w:tabs>
+          <w:tab w:val="num" w:pos="3600"/>
+        </w:tabs>
+        <w:ind w:left="3600" w:hanging="360"/>
+      </w:pPr>
+    </w:lvl>
+    <w:lvl w:ilvl="5" w:tentative="1">
+      <w:start w:val="1"/>
+      <w:numFmt w:val="decimal"/>
+      <w:lvlText w:val="%6."/>
+      <w:lvlJc w:val="left"/>
+      <w:pPr>
+        <w:tabs>
+          <w:tab w:val="num" w:pos="4320"/>
+        </w:tabs>
+        <w:ind w:left="4320" w:hanging="360"/>
+      </w:pPr>
+    </w:lvl>
+    <w:lvl w:ilvl="6" w:tentative="1">
+      <w:start w:val="1"/>
+      <w:numFmt w:val="decimal"/>
+      <w:lvlText w:val="%7."/>
+      <w:lvlJc w:val="left"/>
+      <w:pPr>
+        <w:tabs>
+          <w:tab w:val="num" w:pos="5040"/>
+        </w:tabs>
+        <w:ind w:left="5040" w:hanging="360"/>
+      </w:pPr>
+    </w:lvl>
+    <w:lvl w:ilvl="7" w:tentative="1">
+      <w:start w:val="1"/>
+      <w:numFmt w:val="decimal"/>
+      <w:lvlText w:val="%8."/>
+      <w:lvlJc w:val="left"/>
+      <w:pPr>
+        <w:tabs>
+          <w:tab w:val="num" w:pos="5760"/>
+        </w:tabs>
+        <w:ind w:left="5760" w:hanging="360"/>
+      </w:pPr>
+    </w:lvl>
+    <w:lvl w:ilvl="8" w:tentative="1">
+      <w:start w:val="1"/>
+      <w:numFmt w:val="decimal"/>
+      <w:lvlText w:val="%9."/>
+      <w:lvlJc w:val="left"/>
+      <w:pPr>
+        <w:tabs>
+          <w:tab w:val="num" w:pos="6480"/>
+        </w:tabs>
+        <w:ind w:left="6480" w:hanging="360"/>
+      </w:pPr>
+    </w:lvl>
+  </w:abstractNum>
+  <w:abstractNum w:abstractNumId="4" w15:restartNumberingAfterBreak="0">
     <w:nsid w:val="72184B81"/>
     <w:multiLevelType w:val="multilevel"/>
     <w:tmpl w:val="B3C2A416"/>
@@ -7148,7 +9493,7 @@
       </w:rPr>
     </w:lvl>
   </w:abstractNum>
-  <w:abstractNum w:abstractNumId="3" w15:restartNumberingAfterBreak="0">
+  <w:abstractNum w:abstractNumId="5" w15:restartNumberingAfterBreak="0">
     <w:nsid w:val="725A3FC6"/>
     <w:multiLevelType w:val="multilevel"/>
     <w:tmpl w:val="7BE0CD96"/>
@@ -7298,16 +9643,22 @@
     </w:lvl>
   </w:abstractNum>
   <w:num w:numId="1" w16cid:durableId="1342002136">
-    <w:abstractNumId w:val="3"/>
+    <w:abstractNumId w:val="5"/>
   </w:num>
   <w:num w:numId="2" w16cid:durableId="1588004893">
+    <w:abstractNumId w:val="1"/>
+  </w:num>
+  <w:num w:numId="3" w16cid:durableId="821968730">
+    <w:abstractNumId w:val="4"/>
+  </w:num>
+  <w:num w:numId="4" w16cid:durableId="306934324">
+    <w:abstractNumId w:val="2"/>
+  </w:num>
+  <w:num w:numId="5" w16cid:durableId="537158714">
     <w:abstractNumId w:val="0"/>
   </w:num>
-  <w:num w:numId="3" w16cid:durableId="821968730">
-    <w:abstractNumId w:val="2"/>
-  </w:num>
-  <w:num w:numId="4" w16cid:durableId="306934324">
-    <w:abstractNumId w:val="1"/>
+  <w:num w:numId="6" w16cid:durableId="1760710686">
+    <w:abstractNumId w:val="3"/>
   </w:num>
   <w:numIdMacAtCleanup w:val="4"/>
 </w:numbering>

</xml_diff>